<commit_message>
Publishing pass: add funnel, QA/safety, break-even, financial cards, ESG, key-takeaways visuals; vertically center chapter-end figures and declaration for balanced pages
</commit_message>
<xml_diff>
--- a/BuildWise-Business-Plan/BuildWise_Business_Plan_Report.docx
+++ b/BuildWise-Business-Plan/BuildWise_Business_Plan_Report.docx
@@ -1357,7 +1357,7 @@
                 <w:color w:val="000000"/>
                 <w:sz w:val="24"/>
               </w:rPr>
-              <w:t>18</w:t>
+              <w:t>19</w:t>
             </w:r>
           </w:p>
         </w:tc>
@@ -1428,7 +1428,7 @@
                 <w:color w:val="000000"/>
                 <w:sz w:val="24"/>
               </w:rPr>
-              <w:t>20</w:t>
+              <w:t>21</w:t>
             </w:r>
           </w:p>
         </w:tc>
@@ -1496,7 +1496,7 @@
                 <w:color w:val="000000"/>
                 <w:sz w:val="24"/>
               </w:rPr>
-              <w:t>21</w:t>
+              <w:t>22</w:t>
             </w:r>
           </w:p>
         </w:tc>
@@ -1567,7 +1567,7 @@
                 <w:color w:val="000000"/>
                 <w:sz w:val="24"/>
               </w:rPr>
-              <w:t>23</w:t>
+              <w:t>24</w:t>
             </w:r>
           </w:p>
         </w:tc>
@@ -1635,7 +1635,7 @@
                 <w:color w:val="000000"/>
                 <w:sz w:val="24"/>
               </w:rPr>
-              <w:t>27</w:t>
+              <w:t>29</w:t>
             </w:r>
           </w:p>
         </w:tc>
@@ -1706,7 +1706,7 @@
                 <w:color w:val="000000"/>
                 <w:sz w:val="24"/>
               </w:rPr>
-              <w:t>28</w:t>
+              <w:t>30</w:t>
             </w:r>
           </w:p>
         </w:tc>
@@ -1774,7 +1774,7 @@
                 <w:color w:val="000000"/>
                 <w:sz w:val="24"/>
               </w:rPr>
-              <w:t>29</w:t>
+              <w:t>31</w:t>
             </w:r>
           </w:p>
         </w:tc>
@@ -1845,7 +1845,7 @@
                 <w:color w:val="000000"/>
                 <w:sz w:val="24"/>
               </w:rPr>
-              <w:t>31</w:t>
+              <w:t>33</w:t>
             </w:r>
           </w:p>
         </w:tc>
@@ -1913,7 +1913,7 @@
                 <w:color w:val="000000"/>
                 <w:sz w:val="24"/>
               </w:rPr>
-              <w:t>32</w:t>
+              <w:t>34</w:t>
             </w:r>
           </w:p>
         </w:tc>
@@ -1984,7 +1984,7 @@
                 <w:color w:val="000000"/>
                 <w:sz w:val="24"/>
               </w:rPr>
-              <w:t>33</w:t>
+              <w:t>35</w:t>
             </w:r>
           </w:p>
         </w:tc>
@@ -7637,6 +7637,63 @@
       </w:r>
     </w:p>
     <w:p>
+      <w:pPr>
+        <w:keepNext/>
+        <w:spacing w:before="160" w:after="40"/>
+        <w:jc w:val="center"/>
+      </w:pPr>
+      <w:r>
+        <w:drawing>
+          <wp:inline xmlns:a="http://schemas.openxmlformats.org/drawingml/2006/main" xmlns:pic="http://schemas.openxmlformats.org/drawingml/2006/picture">
+            <wp:extent cx="5852160" cy="3840580"/>
+            <wp:docPr id="6" name="Picture 6"/>
+            <wp:cNvGraphicFramePr>
+              <a:graphicFrameLocks noChangeAspect="1"/>
+            </wp:cNvGraphicFramePr>
+            <a:graphic>
+              <a:graphicData uri="http://schemas.openxmlformats.org/drawingml/2006/picture">
+                <pic:pic>
+                  <pic:nvPicPr>
+                    <pic:cNvPr id="0" name="marketing_funnel.png"/>
+                    <pic:cNvPicPr/>
+                  </pic:nvPicPr>
+                  <pic:blipFill>
+                    <a:blip r:embed="rId16"/>
+                    <a:stretch>
+                      <a:fillRect/>
+                    </a:stretch>
+                  </pic:blipFill>
+                  <pic:spPr>
+                    <a:xfrm>
+                      <a:off x="0" y="0"/>
+                      <a:ext cx="5852160" cy="3840580"/>
+                    </a:xfrm>
+                    <a:prstGeom prst="rect"/>
+                  </pic:spPr>
+                </pic:pic>
+              </a:graphicData>
+            </a:graphic>
+          </wp:inline>
+        </w:drawing>
+      </w:r>
+    </w:p>
+    <w:p>
+      <w:pPr>
+        <w:spacing w:after="240"/>
+        <w:jc w:val="center"/>
+      </w:pPr>
+      <w:r>
+        <w:rPr>
+          <w:rFonts w:ascii="Times New Roman" w:hAnsi="Times New Roman" w:eastAsia="Times New Roman"/>
+          <w:b w:val="0"/>
+          <w:i/>
+          <w:color w:val="595959"/>
+          <w:sz w:val="22"/>
+        </w:rPr>
+        <w:t>Figure 6: BuildWise's customer-acquisition funnel, from initial awareness to long-term advocacy.</w:t>
+      </w:r>
+    </w:p>
+    <w:p>
       <w:r>
         <w:br w:type="page"/>
       </w:r>
@@ -7698,7 +7755,7 @@
         <w:drawing>
           <wp:inline xmlns:a="http://schemas.openxmlformats.org/drawingml/2006/main" xmlns:pic="http://schemas.openxmlformats.org/drawingml/2006/picture">
             <wp:extent cx="5636271" cy="6766560"/>
-            <wp:docPr id="6" name="Picture 6"/>
+            <wp:docPr id="7" name="Picture 7"/>
             <wp:cNvGraphicFramePr>
               <a:graphicFrameLocks noChangeAspect="1"/>
             </wp:cNvGraphicFramePr>
@@ -7710,7 +7767,7 @@
                     <pic:cNvPicPr/>
                   </pic:nvPicPr>
                   <pic:blipFill>
-                    <a:blip r:embed="rId16"/>
+                    <a:blip r:embed="rId17"/>
                     <a:stretch>
                       <a:fillRect/>
                     </a:stretch>
@@ -7742,7 +7799,7 @@
           <w:color w:val="595959"/>
           <w:sz w:val="22"/>
         </w:rPr>
-        <w:t>Figure 6: BuildWise's standard twelve-stage project workflow, followed on every project to ensure consistency and transparency.</w:t>
+        <w:t>Figure 7: BuildWise's standard twelve-stage project workflow, followed on every project to ensure consistency and transparency.</w:t>
       </w:r>
     </w:p>
     <w:p>
@@ -7827,6 +7884,63 @@
       </w:r>
     </w:p>
     <w:p>
+      <w:pPr>
+        <w:keepNext/>
+        <w:spacing w:before="160" w:after="40"/>
+        <w:jc w:val="center"/>
+      </w:pPr>
+      <w:r>
+        <w:drawing>
+          <wp:inline xmlns:a="http://schemas.openxmlformats.org/drawingml/2006/main" xmlns:pic="http://schemas.openxmlformats.org/drawingml/2006/picture">
+            <wp:extent cx="5852160" cy="3195525"/>
+            <wp:docPr id="8" name="Picture 8"/>
+            <wp:cNvGraphicFramePr>
+              <a:graphicFrameLocks noChangeAspect="1"/>
+            </wp:cNvGraphicFramePr>
+            <a:graphic>
+              <a:graphicData uri="http://schemas.openxmlformats.org/drawingml/2006/picture">
+                <pic:pic>
+                  <pic:nvPicPr>
+                    <pic:cNvPr id="0" name="quality_safety.png"/>
+                    <pic:cNvPicPr/>
+                  </pic:nvPicPr>
+                  <pic:blipFill>
+                    <a:blip r:embed="rId18"/>
+                    <a:stretch>
+                      <a:fillRect/>
+                    </a:stretch>
+                  </pic:blipFill>
+                  <pic:spPr>
+                    <a:xfrm>
+                      <a:off x="0" y="0"/>
+                      <a:ext cx="5852160" cy="3195525"/>
+                    </a:xfrm>
+                    <a:prstGeom prst="rect"/>
+                  </pic:spPr>
+                </pic:pic>
+              </a:graphicData>
+            </a:graphic>
+          </wp:inline>
+        </w:drawing>
+      </w:r>
+    </w:p>
+    <w:p>
+      <w:pPr>
+        <w:spacing w:after="240"/>
+        <w:jc w:val="center"/>
+      </w:pPr>
+      <w:r>
+        <w:rPr>
+          <w:rFonts w:ascii="Times New Roman" w:hAnsi="Times New Roman" w:eastAsia="Times New Roman"/>
+          <w:b w:val="0"/>
+          <w:i/>
+          <w:color w:val="595959"/>
+          <w:sz w:val="22"/>
+        </w:rPr>
+        <w:t>Figure 8: BuildWise's stage-wise quality-assurance checkpoints and the safety standards enforced on every site.</w:t>
+      </w:r>
+    </w:p>
+    <w:p>
       <w:r>
         <w:br w:type="page"/>
       </w:r>
@@ -8148,7 +8262,7 @@
         <w:drawing>
           <wp:inline xmlns:a="http://schemas.openxmlformats.org/drawingml/2006/main" xmlns:pic="http://schemas.openxmlformats.org/drawingml/2006/picture">
             <wp:extent cx="5852160" cy="2830768"/>
-            <wp:docPr id="7" name="Picture 7"/>
+            <wp:docPr id="9" name="Picture 9"/>
             <wp:cNvGraphicFramePr>
               <a:graphicFrameLocks noChangeAspect="1"/>
             </wp:cNvGraphicFramePr>
@@ -8160,7 +8274,7 @@
                     <pic:cNvPicPr/>
                   </pic:nvPicPr>
                   <pic:blipFill>
-                    <a:blip r:embed="rId17"/>
+                    <a:blip r:embed="rId19"/>
                     <a:stretch>
                       <a:fillRect/>
                     </a:stretch>
@@ -8192,7 +8306,7 @@
           <w:color w:val="595959"/>
           <w:sz w:val="22"/>
         </w:rPr>
-        <w:t>Figure 7: The BuildWise customer journey, designed so that customer confidence grows at every stage.</w:t>
+        <w:t>Figure 9: The BuildWise customer journey, designed so that customer confidence grows at every stage.</w:t>
       </w:r>
     </w:p>
     <w:p>
@@ -8669,7 +8783,7 @@
         <w:drawing>
           <wp:inline xmlns:a="http://schemas.openxmlformats.org/drawingml/2006/main" xmlns:pic="http://schemas.openxmlformats.org/drawingml/2006/picture">
             <wp:extent cx="5852160" cy="3710816"/>
-            <wp:docPr id="8" name="Picture 8"/>
+            <wp:docPr id="10" name="Picture 10"/>
             <wp:cNvGraphicFramePr>
               <a:graphicFrameLocks noChangeAspect="1"/>
             </wp:cNvGraphicFramePr>
@@ -8681,7 +8795,7 @@
                     <pic:cNvPicPr/>
                   </pic:nvPicPr>
                   <pic:blipFill>
-                    <a:blip r:embed="rId18"/>
+                    <a:blip r:embed="rId20"/>
                     <a:stretch>
                       <a:fillRect/>
                     </a:stretch>
@@ -8713,7 +8827,7 @@
           <w:color w:val="595959"/>
           <w:sz w:val="22"/>
         </w:rPr>
-        <w:t>Figure 8: BuildWise's lean startup-stage organisation structure, with specialised departments introduced as the company grows.</w:t>
+        <w:t>Figure 10: BuildWise's lean startup-stage organisation structure, with specialised departments introduced as the company grows.</w:t>
       </w:r>
     </w:p>
     <w:p>
@@ -8818,6 +8932,63 @@
           <w:sz w:val="24"/>
         </w:rPr>
         <w:t xml:space="preserve"> funded by venture capital, consistent with its philosophy of steady, self-sustaining growth.</w:t>
+      </w:r>
+    </w:p>
+    <w:p>
+      <w:pPr>
+        <w:keepNext/>
+        <w:spacing w:before="160" w:after="40"/>
+        <w:jc w:val="center"/>
+      </w:pPr>
+      <w:r>
+        <w:drawing>
+          <wp:inline xmlns:a="http://schemas.openxmlformats.org/drawingml/2006/main" xmlns:pic="http://schemas.openxmlformats.org/drawingml/2006/picture">
+            <wp:extent cx="5852160" cy="1534342"/>
+            <wp:docPr id="11" name="Picture 11"/>
+            <wp:cNvGraphicFramePr>
+              <a:graphicFrameLocks noChangeAspect="1"/>
+            </wp:cNvGraphicFramePr>
+            <a:graphic>
+              <a:graphicData uri="http://schemas.openxmlformats.org/drawingml/2006/picture">
+                <pic:pic>
+                  <pic:nvPicPr>
+                    <pic:cNvPr id="0" name="financial_summary.png"/>
+                    <pic:cNvPicPr/>
+                  </pic:nvPicPr>
+                  <pic:blipFill>
+                    <a:blip r:embed="rId21"/>
+                    <a:stretch>
+                      <a:fillRect/>
+                    </a:stretch>
+                  </pic:blipFill>
+                  <pic:spPr>
+                    <a:xfrm>
+                      <a:off x="0" y="0"/>
+                      <a:ext cx="5852160" cy="1534342"/>
+                    </a:xfrm>
+                    <a:prstGeom prst="rect"/>
+                  </pic:spPr>
+                </pic:pic>
+              </a:graphicData>
+            </a:graphic>
+          </wp:inline>
+        </w:drawing>
+      </w:r>
+    </w:p>
+    <w:p>
+      <w:pPr>
+        <w:spacing w:after="240"/>
+        <w:jc w:val="center"/>
+      </w:pPr>
+      <w:r>
+        <w:rPr>
+          <w:rFonts w:ascii="Times New Roman" w:hAnsi="Times New Roman" w:eastAsia="Times New Roman"/>
+          <w:b w:val="0"/>
+          <w:i/>
+          <w:color w:val="595959"/>
+          <w:sz w:val="22"/>
+        </w:rPr>
+        <w:t>Figure 11: Financial highlights at a glance.</w:t>
       </w:r>
     </w:p>
     <w:p>
@@ -9708,7 +9879,7 @@
         <w:drawing>
           <wp:inline xmlns:a="http://schemas.openxmlformats.org/drawingml/2006/main" xmlns:pic="http://schemas.openxmlformats.org/drawingml/2006/picture">
             <wp:extent cx="5852160" cy="3126496"/>
-            <wp:docPr id="9" name="Picture 9"/>
+            <wp:docPr id="12" name="Picture 12"/>
             <wp:cNvGraphicFramePr>
               <a:graphicFrameLocks noChangeAspect="1"/>
             </wp:cNvGraphicFramePr>
@@ -9720,7 +9891,7 @@
                     <pic:cNvPicPr/>
                   </pic:nvPicPr>
                   <pic:blipFill>
-                    <a:blip r:embed="rId19"/>
+                    <a:blip r:embed="rId22"/>
                     <a:stretch>
                       <a:fillRect/>
                     </a:stretch>
@@ -9752,7 +9923,7 @@
           <w:color w:val="595959"/>
           <w:sz w:val="22"/>
         </w:rPr>
-        <w:t>Figure 9: Allocation of the ₹1.00 Crore startup capital across major categories.</w:t>
+        <w:t>Figure 12: Allocation of the ₹1.00 Crore startup capital across major categories.</w:t>
       </w:r>
     </w:p>
     <w:p>
@@ -10392,7 +10563,7 @@
         <w:drawing>
           <wp:inline xmlns:a="http://schemas.openxmlformats.org/drawingml/2006/main" xmlns:pic="http://schemas.openxmlformats.org/drawingml/2006/picture">
             <wp:extent cx="5852160" cy="2968875"/>
-            <wp:docPr id="10" name="Picture 10"/>
+            <wp:docPr id="13" name="Picture 13"/>
             <wp:cNvGraphicFramePr>
               <a:graphicFrameLocks noChangeAspect="1"/>
             </wp:cNvGraphicFramePr>
@@ -10404,7 +10575,7 @@
                     <pic:cNvPicPr/>
                   </pic:nvPicPr>
                   <pic:blipFill>
-                    <a:blip r:embed="rId20"/>
+                    <a:blip r:embed="rId23"/>
                     <a:stretch>
                       <a:fillRect/>
                     </a:stretch>
@@ -10436,7 +10607,7 @@
           <w:color w:val="595959"/>
           <w:sz w:val="22"/>
         </w:rPr>
-        <w:t>Figure 10: Projected total revenue and net profit over the first three years (₹ Crore).</w:t>
+        <w:t>Figure 13: Projected total revenue and net profit over the first three years (₹ Crore).</w:t>
       </w:r>
     </w:p>
     <w:p>
@@ -11810,6 +11981,63 @@
       </w:r>
     </w:p>
     <w:p>
+      <w:pPr>
+        <w:keepNext/>
+        <w:spacing w:before="160" w:after="40"/>
+        <w:jc w:val="center"/>
+      </w:pPr>
+      <w:r>
+        <w:drawing>
+          <wp:inline xmlns:a="http://schemas.openxmlformats.org/drawingml/2006/main" xmlns:pic="http://schemas.openxmlformats.org/drawingml/2006/picture">
+            <wp:extent cx="5852160" cy="3187020"/>
+            <wp:docPr id="14" name="Picture 14"/>
+            <wp:cNvGraphicFramePr>
+              <a:graphicFrameLocks noChangeAspect="1"/>
+            </wp:cNvGraphicFramePr>
+            <a:graphic>
+              <a:graphicData uri="http://schemas.openxmlformats.org/drawingml/2006/picture">
+                <pic:pic>
+                  <pic:nvPicPr>
+                    <pic:cNvPr id="0" name="breakeven_chart.png"/>
+                    <pic:cNvPicPr/>
+                  </pic:nvPicPr>
+                  <pic:blipFill>
+                    <a:blip r:embed="rId24"/>
+                    <a:stretch>
+                      <a:fillRect/>
+                    </a:stretch>
+                  </pic:blipFill>
+                  <pic:spPr>
+                    <a:xfrm>
+                      <a:off x="0" y="0"/>
+                      <a:ext cx="5852160" cy="3187020"/>
+                    </a:xfrm>
+                    <a:prstGeom prst="rect"/>
+                  </pic:spPr>
+                </pic:pic>
+              </a:graphicData>
+            </a:graphic>
+          </wp:inline>
+        </w:drawing>
+      </w:r>
+    </w:p>
+    <w:p>
+      <w:pPr>
+        <w:spacing w:after="240"/>
+        <w:jc w:val="center"/>
+      </w:pPr>
+      <w:r>
+        <w:rPr>
+          <w:rFonts w:ascii="Times New Roman" w:hAnsi="Times New Roman" w:eastAsia="Times New Roman"/>
+          <w:b w:val="0"/>
+          <w:i/>
+          <w:color w:val="595959"/>
+          <w:sz w:val="22"/>
+        </w:rPr>
+        <w:t>Figure 14: Break-even analysis — total revenue overtakes total cost at approximately ₹1.50 Crore.</w:t>
+      </w:r>
+    </w:p>
+    <w:p>
       <w:r>
         <w:br w:type="page"/>
       </w:r>
@@ -13049,7 +13277,7 @@
         <w:drawing>
           <wp:inline xmlns:a="http://schemas.openxmlformats.org/drawingml/2006/main" xmlns:pic="http://schemas.openxmlformats.org/drawingml/2006/picture">
             <wp:extent cx="5852160" cy="2904596"/>
-            <wp:docPr id="11" name="Picture 11"/>
+            <wp:docPr id="15" name="Picture 15"/>
             <wp:cNvGraphicFramePr>
               <a:graphicFrameLocks noChangeAspect="1"/>
             </wp:cNvGraphicFramePr>
@@ -13061,7 +13289,7 @@
                     <pic:cNvPicPr/>
                   </pic:nvPicPr>
                   <pic:blipFill>
-                    <a:blip r:embed="rId21"/>
+                    <a:blip r:embed="rId25"/>
                     <a:stretch>
                       <a:fillRect/>
                     </a:stretch>
@@ -13093,7 +13321,7 @@
           <w:color w:val="595959"/>
           <w:sz w:val="22"/>
         </w:rPr>
-        <w:t>Figure 11: BuildWise's technology adoption roadmap, introducing capabilities phase by phase as the business grows.</w:t>
+        <w:t>Figure 15: BuildWise's technology adoption roadmap, introducing capabilities phase by phase as the business grows.</w:t>
       </w:r>
     </w:p>
     <w:p>
@@ -13442,8 +13670,8 @@
       <w:r>
         <w:drawing>
           <wp:inline xmlns:a="http://schemas.openxmlformats.org/drawingml/2006/main" xmlns:pic="http://schemas.openxmlformats.org/drawingml/2006/picture">
-            <wp:extent cx="5852160" cy="2641063"/>
-            <wp:docPr id="12" name="Picture 12"/>
+            <wp:extent cx="5852160" cy="3308375"/>
+            <wp:docPr id="16" name="Picture 16"/>
             <wp:cNvGraphicFramePr>
               <a:graphicFrameLocks noChangeAspect="1"/>
             </wp:cNvGraphicFramePr>
@@ -13455,7 +13683,7 @@
                     <pic:cNvPicPr/>
                   </pic:nvPicPr>
                   <pic:blipFill>
-                    <a:blip r:embed="rId22"/>
+                    <a:blip r:embed="rId26"/>
                     <a:stretch>
                       <a:fillRect/>
                     </a:stretch>
@@ -13463,7 +13691,7 @@
                   <pic:spPr>
                     <a:xfrm>
                       <a:off x="0" y="0"/>
-                      <a:ext cx="5852160" cy="2641063"/>
+                      <a:ext cx="5852160" cy="3308375"/>
                     </a:xfrm>
                     <a:prstGeom prst="rect"/>
                   </pic:spPr>
@@ -13487,7 +13715,7 @@
           <w:color w:val="595959"/>
           <w:sz w:val="22"/>
         </w:rPr>
-        <w:t>Figure 12: BuildWise's five-year growth and expansion timeline, from first projects to technology-enabled operations across India.</w:t>
+        <w:t>Figure 16: BuildWise's five-year growth and expansion timeline, from first projects to technology-enabled operations across India.</w:t>
       </w:r>
     </w:p>
     <w:p>
@@ -13570,6 +13798,63 @@
       </w:r>
     </w:p>
     <w:p>
+      <w:pPr>
+        <w:keepNext/>
+        <w:spacing w:before="160" w:after="40"/>
+        <w:jc w:val="center"/>
+      </w:pPr>
+      <w:r>
+        <w:drawing>
+          <wp:inline xmlns:a="http://schemas.openxmlformats.org/drawingml/2006/main" xmlns:pic="http://schemas.openxmlformats.org/drawingml/2006/picture">
+            <wp:extent cx="5852160" cy="3586299"/>
+            <wp:docPr id="17" name="Picture 17"/>
+            <wp:cNvGraphicFramePr>
+              <a:graphicFrameLocks noChangeAspect="1"/>
+            </wp:cNvGraphicFramePr>
+            <a:graphic>
+              <a:graphicData uri="http://schemas.openxmlformats.org/drawingml/2006/picture">
+                <pic:pic>
+                  <pic:nvPicPr>
+                    <pic:cNvPr id="0" name="esg_sustainability.png"/>
+                    <pic:cNvPicPr/>
+                  </pic:nvPicPr>
+                  <pic:blipFill>
+                    <a:blip r:embed="rId27"/>
+                    <a:stretch>
+                      <a:fillRect/>
+                    </a:stretch>
+                  </pic:blipFill>
+                  <pic:spPr>
+                    <a:xfrm>
+                      <a:off x="0" y="0"/>
+                      <a:ext cx="5852160" cy="3586299"/>
+                    </a:xfrm>
+                    <a:prstGeom prst="rect"/>
+                  </pic:spPr>
+                </pic:pic>
+              </a:graphicData>
+            </a:graphic>
+          </wp:inline>
+        </w:drawing>
+      </w:r>
+    </w:p>
+    <w:p>
+      <w:pPr>
+        <w:spacing w:after="240"/>
+        <w:jc w:val="center"/>
+      </w:pPr>
+      <w:r>
+        <w:rPr>
+          <w:rFonts w:ascii="Times New Roman" w:hAnsi="Times New Roman" w:eastAsia="Times New Roman"/>
+          <w:b w:val="0"/>
+          <w:i/>
+          <w:color w:val="595959"/>
+          <w:sz w:val="22"/>
+        </w:rPr>
+        <w:t>Figure 17: BuildWise's sustainability and ESG framework across environmental, social, and governance pillars.</w:t>
+      </w:r>
+    </w:p>
+    <w:p>
       <w:r>
         <w:br w:type="page"/>
       </w:r>
@@ -13648,6 +13933,63 @@
           <w:sz w:val="24"/>
         </w:rPr>
         <w:t xml:space="preserve"> — the company intends to grow one excellent project, one satisfied customer, and one reinvested rupee at a time.</w:t>
+      </w:r>
+    </w:p>
+    <w:p>
+      <w:pPr>
+        <w:keepNext/>
+        <w:spacing w:before="160" w:after="40"/>
+        <w:jc w:val="center"/>
+      </w:pPr>
+      <w:r>
+        <w:drawing>
+          <wp:inline xmlns:a="http://schemas.openxmlformats.org/drawingml/2006/main" xmlns:pic="http://schemas.openxmlformats.org/drawingml/2006/picture">
+            <wp:extent cx="5852160" cy="3488606"/>
+            <wp:docPr id="18" name="Picture 18"/>
+            <wp:cNvGraphicFramePr>
+              <a:graphicFrameLocks noChangeAspect="1"/>
+            </wp:cNvGraphicFramePr>
+            <a:graphic>
+              <a:graphicData uri="http://schemas.openxmlformats.org/drawingml/2006/picture">
+                <pic:pic>
+                  <pic:nvPicPr>
+                    <pic:cNvPr id="0" name="key_takeaways.png"/>
+                    <pic:cNvPicPr/>
+                  </pic:nvPicPr>
+                  <pic:blipFill>
+                    <a:blip r:embed="rId28"/>
+                    <a:stretch>
+                      <a:fillRect/>
+                    </a:stretch>
+                  </pic:blipFill>
+                  <pic:spPr>
+                    <a:xfrm>
+                      <a:off x="0" y="0"/>
+                      <a:ext cx="5852160" cy="3488606"/>
+                    </a:xfrm>
+                    <a:prstGeom prst="rect"/>
+                  </pic:spPr>
+                </pic:pic>
+              </a:graphicData>
+            </a:graphic>
+          </wp:inline>
+        </w:drawing>
+      </w:r>
+    </w:p>
+    <w:p>
+      <w:pPr>
+        <w:spacing w:after="240"/>
+        <w:jc w:val="center"/>
+      </w:pPr>
+      <w:r>
+        <w:rPr>
+          <w:rFonts w:ascii="Times New Roman" w:hAnsi="Times New Roman" w:eastAsia="Times New Roman"/>
+          <w:b w:val="0"/>
+          <w:i/>
+          <w:color w:val="595959"/>
+          <w:sz w:val="22"/>
+        </w:rPr>
+        <w:t>Figure 18: Key takeaways from the BuildWise business plan.</w:t>
       </w:r>
     </w:p>
     <w:p>

</xml_diff>

<commit_message>
Information-architecture pass: skimmable Executive Summary with KPI cards, callout/highlight boxes, services & market-trends tables
</commit_message>
<xml_diff>
--- a/BuildWise-Business-Plan/BuildWise_Business_Plan_Report.docx
+++ b/BuildWise-Business-Plan/BuildWise_Business_Plan_Report.docx
@@ -2019,15 +2019,13 @@
       <w:r>
         <w:rPr>
           <w:rFonts w:ascii="Times New Roman" w:hAnsi="Times New Roman" w:eastAsia="Times New Roman"/>
-          <w:b w:val="0"/>
+          <w:b/>
           <w:i w:val="0"/>
           <w:color w:val="000000"/>
           <w:sz w:val="24"/>
         </w:rPr>
-        <w:t>BuildWise Constructions Pvt. Ltd. is a technology-enabled construction startup based in Chennai, Tamil Nadu, established in 2026. The company provides residential construction, commercial construction, renovation, interior works, and turnkey project services to individual homeowners, small business owners, and property investors. BuildWise begins as a focused, service-led construction firm and follows a phased growth strategy that introduces digital systems and construction technology only after the business achieves stable revenue and customer trust.</w:t>
-      </w:r>
-    </w:p>
-    <w:p>
+        <w:t>Business Name:</w:t>
+      </w:r>
       <w:r>
         <w:rPr>
           <w:rFonts w:ascii="Times New Roman" w:hAnsi="Times New Roman" w:eastAsia="Times New Roman"/>
@@ -2036,10 +2034,20 @@
           <w:color w:val="000000"/>
           <w:sz w:val="24"/>
         </w:rPr>
-        <w:t>The Indian construction sector is among the largest contributors to the national economy and continues to expand steadily on the back of urbanisation, housing demand, and infrastructure investment. Despite this growth, customers frequently encounter unclear pricing, unreliable execution, weak documentation, delayed handovers, and poor communication. BuildWise is built specifically to address these gaps. The company does not compete on the lowest price; it competes on transparency, reliability, professional project management, and long-term customer relationships.</w:t>
+        <w:t xml:space="preserve"> BuildWise Constructions Pvt. Ltd.</w:t>
       </w:r>
     </w:p>
     <w:p>
+      <w:r>
+        <w:rPr>
+          <w:rFonts w:ascii="Times New Roman" w:hAnsi="Times New Roman" w:eastAsia="Times New Roman"/>
+          <w:b/>
+          <w:i w:val="0"/>
+          <w:color w:val="000000"/>
+          <w:sz w:val="24"/>
+        </w:rPr>
+        <w:t>Industry:</w:t>
+      </w:r>
       <w:r>
         <w:rPr>
           <w:rFonts w:ascii="Times New Roman" w:hAnsi="Times New Roman" w:eastAsia="Times New Roman"/>
@@ -2048,10 +2056,20 @@
           <w:color w:val="000000"/>
           <w:sz w:val="24"/>
         </w:rPr>
-        <w:t>The business is founded with a startup capital of ₹1.00 Crore, funded through the promoter's own contribution and support from family and informal investors rather than venture capital. This capital is allocated across office setup, legal registration, engineering software, equipment, marketing, working capital, salaries, and an emergency reserve. The company is expected to reach operational break-even within the first year and to grow revenue from approximately ₹2.0 Crore in Year 1 to ₹8.75 Crore in Year 3, while maintaining conservative and realistic profit margins.</w:t>
+        <w:t xml:space="preserve"> Technology-enabled construction startup based in Chennai, Tamil Nadu, established in 2026.</w:t>
       </w:r>
     </w:p>
     <w:p>
+      <w:r>
+        <w:rPr>
+          <w:rFonts w:ascii="Times New Roman" w:hAnsi="Times New Roman" w:eastAsia="Times New Roman"/>
+          <w:b/>
+          <w:i w:val="0"/>
+          <w:color w:val="000000"/>
+          <w:sz w:val="24"/>
+        </w:rPr>
+        <w:t>Mission:</w:t>
+      </w:r>
       <w:r>
         <w:rPr>
           <w:rFonts w:ascii="Times New Roman" w:hAnsi="Times New Roman" w:eastAsia="Times New Roman"/>
@@ -2060,8 +2078,10 @@
           <w:color w:val="000000"/>
           <w:sz w:val="24"/>
         </w:rPr>
-        <w:t xml:space="preserve">BuildWise follows a four-phase growth model: </w:t>
-      </w:r>
+        <w:t xml:space="preserve"> To provide transparent, reliable, high-quality, and customer-centric construction services while gradually transforming into one of India's most trusted technology-enabled construction companies.</w:t>
+      </w:r>
+    </w:p>
+    <w:p>
       <w:r>
         <w:rPr>
           <w:rFonts w:ascii="Times New Roman" w:hAnsi="Times New Roman" w:eastAsia="Times New Roman"/>
@@ -2070,7 +2090,7 @@
           <w:color w:val="000000"/>
           <w:sz w:val="24"/>
         </w:rPr>
-        <w:t>Phase 1 – Business Foundation</w:t>
+        <w:t>Problem:</w:t>
       </w:r>
       <w:r>
         <w:rPr>
@@ -2080,8 +2100,10 @@
           <w:color w:val="000000"/>
           <w:sz w:val="24"/>
         </w:rPr>
-        <w:t xml:space="preserve">, focused purely on delivering excellent projects; </w:t>
-      </w:r>
+        <w:t xml:space="preserve"> Customers frequently encounter unclear pricing, unreliable execution, weak documentation, delayed handovers, and poor communication.</w:t>
+      </w:r>
+    </w:p>
+    <w:p>
       <w:r>
         <w:rPr>
           <w:rFonts w:ascii="Times New Roman" w:hAnsi="Times New Roman" w:eastAsia="Times New Roman"/>
@@ -2090,7 +2112,7 @@
           <w:color w:val="000000"/>
           <w:sz w:val="24"/>
         </w:rPr>
-        <w:t>Phase 2 – Digital Foundation</w:t>
+        <w:t>Solution:</w:t>
       </w:r>
       <w:r>
         <w:rPr>
@@ -2100,8 +2122,10 @@
           <w:color w:val="000000"/>
           <w:sz w:val="24"/>
         </w:rPr>
-        <w:t xml:space="preserve">, introducing a website, customer portal, and digital documentation; </w:t>
-      </w:r>
+        <w:t xml:space="preserve"> BuildWise addresses these gaps by competing on transparency, reliability, professional project management, and long-term customer relationships — not on the lowest price.</w:t>
+      </w:r>
+    </w:p>
+    <w:p>
       <w:r>
         <w:rPr>
           <w:rFonts w:ascii="Times New Roman" w:hAnsi="Times New Roman" w:eastAsia="Times New Roman"/>
@@ -2110,7 +2134,7 @@
           <w:color w:val="000000"/>
           <w:sz w:val="24"/>
         </w:rPr>
-        <w:t>Phase 3 – Technology Integration</w:t>
+        <w:t>Target Customers:</w:t>
       </w:r>
       <w:r>
         <w:rPr>
@@ -2120,8 +2144,10 @@
           <w:color w:val="000000"/>
           <w:sz w:val="24"/>
         </w:rPr>
-        <w:t xml:space="preserve">, adding material tracking, inventory systems, and AI-assisted estimation; and </w:t>
-      </w:r>
+        <w:t xml:space="preserve"> Individual homeowners, small business owners, and property investors.</w:t>
+      </w:r>
+    </w:p>
+    <w:p>
       <w:r>
         <w:rPr>
           <w:rFonts w:ascii="Times New Roman" w:hAnsi="Times New Roman" w:eastAsia="Times New Roman"/>
@@ -2130,7 +2156,7 @@
           <w:color w:val="000000"/>
           <w:sz w:val="24"/>
         </w:rPr>
-        <w:t>Phase 4 – Expansion</w:t>
+        <w:t>Key Services:</w:t>
       </w:r>
       <w:r>
         <w:rPr>
@@ -2140,10 +2166,20 @@
           <w:color w:val="000000"/>
           <w:sz w:val="24"/>
         </w:rPr>
-        <w:t>, scaling across multiple Indian cities with commercial projects, premium housing, and smart construction solutions. Technology is treated as an outcome of business growth, never as a precondition for it.</w:t>
+        <w:t xml:space="preserve"> Residential construction, commercial construction, renovation, interior works, and turnkey projects.</w:t>
       </w:r>
     </w:p>
     <w:p>
+      <w:r>
+        <w:rPr>
+          <w:rFonts w:ascii="Times New Roman" w:hAnsi="Times New Roman" w:eastAsia="Times New Roman"/>
+          <w:b/>
+          <w:i w:val="0"/>
+          <w:color w:val="000000"/>
+          <w:sz w:val="24"/>
+        </w:rPr>
+        <w:t>Competitive Advantages:</w:t>
+      </w:r>
       <w:r>
         <w:rPr>
           <w:rFonts w:ascii="Times New Roman" w:hAnsi="Times New Roman" w:eastAsia="Times New Roman"/>
@@ -2152,7 +2188,259 @@
           <w:color w:val="000000"/>
           <w:sz w:val="24"/>
         </w:rPr>
-        <w:t>This report presents a complete and realistic roadmap for building BuildWise from a small, trusted local construction firm into one of India's most reliable technology-enabled construction companies.</w:t>
+        <w:t xml:space="preserve"> Transparency, reliability, professional project management, and long-term customer relationships, delivered through a phased, self-funded growth model.</w:t>
+      </w:r>
+    </w:p>
+    <w:p>
+      <w:r>
+        <w:rPr>
+          <w:rFonts w:ascii="Times New Roman" w:hAnsi="Times New Roman" w:eastAsia="Times New Roman"/>
+          <w:b/>
+          <w:i w:val="0"/>
+          <w:color w:val="000000"/>
+          <w:sz w:val="24"/>
+        </w:rPr>
+        <w:t>Growth Model:</w:t>
+      </w:r>
+      <w:r>
+        <w:rPr>
+          <w:rFonts w:ascii="Times New Roman" w:hAnsi="Times New Roman" w:eastAsia="Times New Roman"/>
+          <w:b w:val="0"/>
+          <w:i w:val="0"/>
+          <w:color w:val="000000"/>
+          <w:sz w:val="24"/>
+        </w:rPr>
+        <w:t xml:space="preserve"> Four phases — Business Foundation, Digital Foundation, Technology Integration, and Expansion. Technology is treated as an outcome of business growth, never as a precondition for it.</w:t>
+      </w:r>
+    </w:p>
+    <w:p>
+      <w:r>
+        <w:rPr>
+          <w:rFonts w:ascii="Times New Roman" w:hAnsi="Times New Roman" w:eastAsia="Times New Roman"/>
+          <w:b/>
+          <w:i w:val="0"/>
+          <w:color w:val="000000"/>
+          <w:sz w:val="24"/>
+        </w:rPr>
+        <w:t>Financial Highlights:</w:t>
+      </w:r>
+    </w:p>
+    <w:tbl>
+      <w:tblPr>
+        <w:tblW w:type="auto" w:w="0"/>
+        <w:jc w:val="center"/>
+        <w:tblLook w:firstColumn="1" w:firstRow="1" w:lastColumn="0" w:lastRow="0" w:noHBand="0" w:noVBand="1" w:val="04A0"/>
+        <w:tblCellMar>
+          <w:top w:w="120" w:type="dxa"/>
+          <w:bottom w:w="120" w:type="dxa"/>
+          <w:start w:w="70" w:type="dxa"/>
+          <w:end w:w="70" w:type="dxa"/>
+          <w:left w:w="70" w:type="dxa"/>
+          <w:right w:w="70" w:type="dxa"/>
+        </w:tblCellMar>
+      </w:tblPr>
+      <w:tblGrid>
+        <w:gridCol w:w="2379"/>
+        <w:gridCol w:w="2379"/>
+        <w:gridCol w:w="2379"/>
+        <w:gridCol w:w="2379"/>
+      </w:tblGrid>
+      <w:tr>
+        <w:tc>
+          <w:tcPr>
+            <w:tcW w:type="dxa" w:w="2268"/>
+            <w:vAlign w:val="center"/>
+            <w:shd w:val="clear" w:fill="163A6B"/>
+            <w:tcBorders>
+              <w:left w:val="single" w:sz="12" w:space="0" w:color="FFFFFF"/>
+            </w:tcBorders>
+          </w:tcPr>
+          <w:p>
+            <w:pPr>
+              <w:spacing w:after="40"/>
+              <w:jc w:val="center"/>
+            </w:pPr>
+            <w:r>
+              <w:rPr>
+                <w:rFonts w:ascii="Cambria" w:hAnsi="Cambria" w:eastAsia="Cambria"/>
+                <w:b/>
+                <w:i w:val="0"/>
+                <w:color w:val="FFFFFF"/>
+                <w:sz w:val="36"/>
+              </w:rPr>
+              <w:t>₹1.00 Cr</w:t>
+            </w:r>
+          </w:p>
+          <w:p>
+            <w:pPr>
+              <w:spacing w:after="0"/>
+              <w:jc w:val="center"/>
+            </w:pPr>
+            <w:r>
+              <w:rPr>
+                <w:rFonts w:ascii="Times New Roman" w:hAnsi="Times New Roman" w:eastAsia="Times New Roman"/>
+                <w:b w:val="0"/>
+                <w:i w:val="0"/>
+                <w:color w:val="D6E0EE"/>
+                <w:sz w:val="19"/>
+              </w:rPr>
+              <w:t>Startup Capital</w:t>
+            </w:r>
+          </w:p>
+        </w:tc>
+        <w:tc>
+          <w:tcPr>
+            <w:tcW w:type="dxa" w:w="2268"/>
+            <w:vAlign w:val="center"/>
+            <w:shd w:val="clear" w:fill="163A6B"/>
+            <w:tcBorders>
+              <w:left w:val="single" w:sz="12" w:space="0" w:color="FFFFFF"/>
+            </w:tcBorders>
+          </w:tcPr>
+          <w:p>
+            <w:pPr>
+              <w:spacing w:after="40"/>
+              <w:jc w:val="center"/>
+            </w:pPr>
+            <w:r>
+              <w:rPr>
+                <w:rFonts w:ascii="Cambria" w:hAnsi="Cambria" w:eastAsia="Cambria"/>
+                <w:b/>
+                <w:i w:val="0"/>
+                <w:color w:val="FFFFFF"/>
+                <w:sz w:val="36"/>
+              </w:rPr>
+              <w:t>Year 1</w:t>
+            </w:r>
+          </w:p>
+          <w:p>
+            <w:pPr>
+              <w:spacing w:after="0"/>
+              <w:jc w:val="center"/>
+            </w:pPr>
+            <w:r>
+              <w:rPr>
+                <w:rFonts w:ascii="Times New Roman" w:hAnsi="Times New Roman" w:eastAsia="Times New Roman"/>
+                <w:b w:val="0"/>
+                <w:i w:val="0"/>
+                <w:color w:val="D6E0EE"/>
+                <w:sz w:val="19"/>
+              </w:rPr>
+              <w:t>Break-even</w:t>
+            </w:r>
+          </w:p>
+        </w:tc>
+        <w:tc>
+          <w:tcPr>
+            <w:tcW w:type="dxa" w:w="2268"/>
+            <w:vAlign w:val="center"/>
+            <w:shd w:val="clear" w:fill="163A6B"/>
+            <w:tcBorders>
+              <w:left w:val="single" w:sz="12" w:space="0" w:color="FFFFFF"/>
+            </w:tcBorders>
+          </w:tcPr>
+          <w:p>
+            <w:pPr>
+              <w:spacing w:after="40"/>
+              <w:jc w:val="center"/>
+            </w:pPr>
+            <w:r>
+              <w:rPr>
+                <w:rFonts w:ascii="Cambria" w:hAnsi="Cambria" w:eastAsia="Cambria"/>
+                <w:b/>
+                <w:i w:val="0"/>
+                <w:color w:val="FFFFFF"/>
+                <w:sz w:val="36"/>
+              </w:rPr>
+              <w:t>₹2.02 Cr</w:t>
+            </w:r>
+          </w:p>
+          <w:p>
+            <w:pPr>
+              <w:spacing w:after="0"/>
+              <w:jc w:val="center"/>
+            </w:pPr>
+            <w:r>
+              <w:rPr>
+                <w:rFonts w:ascii="Times New Roman" w:hAnsi="Times New Roman" w:eastAsia="Times New Roman"/>
+                <w:b w:val="0"/>
+                <w:i w:val="0"/>
+                <w:color w:val="D6E0EE"/>
+                <w:sz w:val="19"/>
+              </w:rPr>
+              <w:t>Year 1 Revenue</w:t>
+            </w:r>
+          </w:p>
+        </w:tc>
+        <w:tc>
+          <w:tcPr>
+            <w:tcW w:type="dxa" w:w="2268"/>
+            <w:vAlign w:val="center"/>
+            <w:shd w:val="clear" w:fill="163A6B"/>
+            <w:tcBorders>
+              <w:left w:val="single" w:sz="12" w:space="0" w:color="FFFFFF"/>
+            </w:tcBorders>
+          </w:tcPr>
+          <w:p>
+            <w:pPr>
+              <w:spacing w:after="40"/>
+              <w:jc w:val="center"/>
+            </w:pPr>
+            <w:r>
+              <w:rPr>
+                <w:rFonts w:ascii="Cambria" w:hAnsi="Cambria" w:eastAsia="Cambria"/>
+                <w:b/>
+                <w:i w:val="0"/>
+                <w:color w:val="FFFFFF"/>
+                <w:sz w:val="36"/>
+              </w:rPr>
+              <w:t>₹8.76 Cr</w:t>
+            </w:r>
+          </w:p>
+          <w:p>
+            <w:pPr>
+              <w:spacing w:after="0"/>
+              <w:jc w:val="center"/>
+            </w:pPr>
+            <w:r>
+              <w:rPr>
+                <w:rFonts w:ascii="Times New Roman" w:hAnsi="Times New Roman" w:eastAsia="Times New Roman"/>
+                <w:b w:val="0"/>
+                <w:i w:val="0"/>
+                <w:color w:val="D6E0EE"/>
+                <w:sz w:val="19"/>
+              </w:rPr>
+              <w:t>Year 3 Revenue</w:t>
+            </w:r>
+          </w:p>
+        </w:tc>
+      </w:tr>
+    </w:tbl>
+    <w:p>
+      <w:pPr>
+        <w:spacing w:after="80"/>
+      </w:pPr>
+    </w:p>
+    <w:p>
+      <w:r>
+        <w:rPr>
+          <w:rFonts w:ascii="Times New Roman" w:hAnsi="Times New Roman" w:eastAsia="Times New Roman"/>
+          <w:b/>
+          <w:i w:val="0"/>
+          <w:color w:val="000000"/>
+          <w:sz w:val="24"/>
+        </w:rPr>
+        <w:t>Future Vision:</w:t>
+      </w:r>
+      <w:r>
+        <w:rPr>
+          <w:rFonts w:ascii="Times New Roman" w:hAnsi="Times New Roman" w:eastAsia="Times New Roman"/>
+          <w:b w:val="0"/>
+          <w:i w:val="0"/>
+          <w:color w:val="000000"/>
+          <w:sz w:val="24"/>
+        </w:rPr>
+        <w:t xml:space="preserve"> To build BuildWise from a small, trusted local construction firm into one of India's most reliable technology-enabled construction companies.</w:t>
       </w:r>
     </w:p>
     <w:p>
@@ -3159,6 +3447,70 @@
         <w:t>2.7 Company Philosophy</w:t>
       </w:r>
     </w:p>
+    <w:tbl>
+      <w:tblPr>
+        <w:tblW w:type="auto" w:w="0"/>
+        <w:jc w:val="center"/>
+        <w:tblLook w:firstColumn="1" w:firstRow="1" w:lastColumn="0" w:lastRow="0" w:noHBand="0" w:noVBand="1" w:val="04A0"/>
+        <w:tblCellMar>
+          <w:top w:w="110" w:type="dxa"/>
+          <w:bottom w:w="110" w:type="dxa"/>
+          <w:start w:w="180" w:type="dxa"/>
+          <w:end w:w="150" w:type="dxa"/>
+          <w:left w:w="180" w:type="dxa"/>
+          <w:right w:w="150" w:type="dxa"/>
+        </w:tblCellMar>
+      </w:tblPr>
+      <w:tblGrid>
+        <w:gridCol w:w="9518"/>
+      </w:tblGrid>
+      <w:tr>
+        <w:tc>
+          <w:tcPr>
+            <w:tcW w:type="dxa" w:w="9518"/>
+            <w:shd w:val="clear" w:fill="EEF2F8"/>
+            <w:tcBorders>
+              <w:left w:val="single" w:sz="30" w:space="0" w:color="163A6B"/>
+            </w:tcBorders>
+          </w:tcPr>
+          <w:p>
+            <w:pPr>
+              <w:spacing w:after="40"/>
+            </w:pPr>
+            <w:r>
+              <w:rPr>
+                <w:rFonts w:ascii="Cambria" w:hAnsi="Cambria" w:eastAsia="Cambria"/>
+                <w:b/>
+                <w:i w:val="0"/>
+                <w:color w:val="163A6B"/>
+                <w:sz w:val="24"/>
+              </w:rPr>
+              <w:t>Company Motto</w:t>
+            </w:r>
+          </w:p>
+          <w:p>
+            <w:pPr>
+              <w:spacing w:after="0"/>
+            </w:pPr>
+            <w:r>
+              <w:rPr>
+                <w:rFonts w:ascii="Times New Roman" w:hAnsi="Times New Roman" w:eastAsia="Times New Roman"/>
+                <w:b w:val="0"/>
+                <w:i w:val="0"/>
+                <w:color w:val="000000"/>
+                <w:sz w:val="23"/>
+              </w:rPr>
+              <w:t>"Building Trust, Brick by Brick."</w:t>
+            </w:r>
+          </w:p>
+        </w:tc>
+      </w:tr>
+    </w:tbl>
+    <w:p>
+      <w:pPr>
+        <w:spacing w:after="80"/>
+      </w:pPr>
+    </w:p>
     <w:p>
       <w:r>
         <w:rPr>
@@ -3168,27 +3520,7 @@
           <w:color w:val="000000"/>
           <w:sz w:val="24"/>
         </w:rPr>
-        <w:t xml:space="preserve">BuildWise is guided by a simple, enduring motto: </w:t>
-      </w:r>
-      <w:r>
-        <w:rPr>
-          <w:rFonts w:ascii="Times New Roman" w:hAnsi="Times New Roman" w:eastAsia="Times New Roman"/>
-          <w:b w:val="0"/>
-          <w:i/>
-          <w:color w:val="000000"/>
-          <w:sz w:val="24"/>
-        </w:rPr>
-        <w:t>"Building Trust, Brick by Brick."</w:t>
-      </w:r>
-      <w:r>
-        <w:rPr>
-          <w:rFonts w:ascii="Times New Roman" w:hAnsi="Times New Roman" w:eastAsia="Times New Roman"/>
-          <w:b w:val="0"/>
-          <w:i w:val="0"/>
-          <w:color w:val="000000"/>
-          <w:sz w:val="24"/>
-        </w:rPr>
-        <w:t xml:space="preserve"> The company believes that trust in construction is not won through advertising or promises, but earned gradually — through transparent pricing, honest communication, disciplined execution, and consistent quality on every project. This philosophy shapes how the company grows: reputation first, revenue next, and technology only when it genuinely strengthens the customer experience. Each completed project is treated as one more block in a long-term relationship with the customer and the wider community.</w:t>
+        <w:t>BuildWise believes that trust in construction is not won through advertising or promises, but earned gradually — through transparent pricing, honest communication, disciplined execution, and consistent quality on every project. This philosophy shapes how the company grows: reputation first, revenue next, and technology only when it genuinely strengthens the customer experience. Each completed project is treated as one more block in a long-term relationship with the customer and the wider community.</w:t>
       </w:r>
     </w:p>
     <w:p>
@@ -3327,135 +3659,315 @@
         <w:t>3.2 Market Trends</w:t>
       </w:r>
     </w:p>
+    <w:tbl>
+      <w:tblPr>
+        <w:tblStyle w:val="TableGrid"/>
+        <w:tblW w:type="auto" w:w="0"/>
+        <w:jc w:val="center"/>
+        <w:tblLook w:firstColumn="1" w:firstRow="1" w:lastColumn="0" w:lastRow="0" w:noHBand="0" w:noVBand="1" w:val="04A0"/>
+        <w:tblCellMar>
+          <w:top w:w="60" w:type="dxa"/>
+          <w:bottom w:w="60" w:type="dxa"/>
+          <w:start w:w="110" w:type="dxa"/>
+          <w:end w:w="110" w:type="dxa"/>
+          <w:left w:w="110" w:type="dxa"/>
+          <w:right w:w="110" w:type="dxa"/>
+        </w:tblCellMar>
+      </w:tblPr>
+      <w:tblGrid>
+        <w:gridCol w:w="4759"/>
+        <w:gridCol w:w="4759"/>
+      </w:tblGrid>
+      <w:tr>
+        <w:trPr>
+          <w:tblHeader w:val="true"/>
+        </w:trPr>
+        <w:tc>
+          <w:tcPr>
+            <w:tcW w:type="dxa" w:w="4759"/>
+            <w:vAlign w:val="center"/>
+            <w:shd w:val="clear" w:fill="163A6B"/>
+          </w:tcPr>
+          <w:p>
+            <w:pPr>
+              <w:spacing w:after="40" w:before="40"/>
+              <w:jc w:val="left"/>
+            </w:pPr>
+            <w:r>
+              <w:rPr>
+                <w:rFonts w:ascii="Cambria" w:hAnsi="Cambria" w:eastAsia="Cambria"/>
+                <w:b/>
+                <w:i w:val="0"/>
+                <w:color w:val="FFFFFF"/>
+                <w:sz w:val="22"/>
+              </w:rPr>
+              <w:t>Trend</w:t>
+            </w:r>
+          </w:p>
+        </w:tc>
+        <w:tc>
+          <w:tcPr>
+            <w:tcW w:type="dxa" w:w="4759"/>
+            <w:vAlign w:val="center"/>
+            <w:shd w:val="clear" w:fill="163A6B"/>
+          </w:tcPr>
+          <w:p>
+            <w:pPr>
+              <w:spacing w:after="40" w:before="40"/>
+              <w:jc w:val="left"/>
+            </w:pPr>
+            <w:r>
+              <w:rPr>
+                <w:rFonts w:ascii="Cambria" w:hAnsi="Cambria" w:eastAsia="Cambria"/>
+                <w:b/>
+                <w:i w:val="0"/>
+                <w:color w:val="FFFFFF"/>
+                <w:sz w:val="22"/>
+              </w:rPr>
+              <w:t>What It Means for BuildWise</w:t>
+            </w:r>
+          </w:p>
+        </w:tc>
+      </w:tr>
+      <w:tr>
+        <w:tc>
+          <w:tcPr>
+            <w:tcW w:type="dxa" w:w="4759"/>
+            <w:vAlign w:val="center"/>
+          </w:tcPr>
+          <w:p>
+            <w:pPr>
+              <w:spacing w:after="40" w:before="40"/>
+              <w:jc w:val="left"/>
+            </w:pPr>
+            <w:r>
+              <w:rPr>
+                <w:rFonts w:ascii="Times New Roman" w:hAnsi="Times New Roman" w:eastAsia="Times New Roman"/>
+                <w:b w:val="0"/>
+                <w:i w:val="0"/>
+                <w:color w:val="000000"/>
+                <w:sz w:val="22"/>
+              </w:rPr>
+              <w:t>Demand for transparency</w:t>
+            </w:r>
+          </w:p>
+        </w:tc>
+        <w:tc>
+          <w:tcPr>
+            <w:tcW w:type="dxa" w:w="4759"/>
+            <w:vAlign w:val="center"/>
+          </w:tcPr>
+          <w:p>
+            <w:pPr>
+              <w:spacing w:after="40" w:before="40"/>
+              <w:jc w:val="left"/>
+            </w:pPr>
+            <w:r>
+              <w:rPr>
+                <w:rFonts w:ascii="Times New Roman" w:hAnsi="Times New Roman" w:eastAsia="Times New Roman"/>
+                <w:b w:val="0"/>
+                <w:i w:val="0"/>
+                <w:color w:val="000000"/>
+                <w:sz w:val="22"/>
+              </w:rPr>
+              <w:t>Customers increasingly expect clear pricing, documentation, and regular updates.</w:t>
+            </w:r>
+          </w:p>
+        </w:tc>
+      </w:tr>
+      <w:tr>
+        <w:tc>
+          <w:tcPr>
+            <w:tcW w:type="dxa" w:w="4759"/>
+            <w:vAlign w:val="center"/>
+            <w:shd w:val="clear" w:fill="EEF2F8"/>
+          </w:tcPr>
+          <w:p>
+            <w:pPr>
+              <w:spacing w:after="40" w:before="40"/>
+              <w:jc w:val="left"/>
+            </w:pPr>
+            <w:r>
+              <w:rPr>
+                <w:rFonts w:ascii="Times New Roman" w:hAnsi="Times New Roman" w:eastAsia="Times New Roman"/>
+                <w:b w:val="0"/>
+                <w:i w:val="0"/>
+                <w:color w:val="000000"/>
+                <w:sz w:val="22"/>
+              </w:rPr>
+              <w:t>Rising input costs</w:t>
+            </w:r>
+          </w:p>
+        </w:tc>
+        <w:tc>
+          <w:tcPr>
+            <w:tcW w:type="dxa" w:w="4759"/>
+            <w:vAlign w:val="center"/>
+            <w:shd w:val="clear" w:fill="EEF2F8"/>
+          </w:tcPr>
+          <w:p>
+            <w:pPr>
+              <w:spacing w:after="40" w:before="40"/>
+              <w:jc w:val="left"/>
+            </w:pPr>
+            <w:r>
+              <w:rPr>
+                <w:rFonts w:ascii="Times New Roman" w:hAnsi="Times New Roman" w:eastAsia="Times New Roman"/>
+                <w:b w:val="0"/>
+                <w:i w:val="0"/>
+                <w:color w:val="000000"/>
+                <w:sz w:val="22"/>
+              </w:rPr>
+              <w:t>Construction costs are projected to rise by around 3–5% in 2026, driven largely by labour cost inflation, making accurate estimation and disciplined project management essential [5].</w:t>
+            </w:r>
+          </w:p>
+        </w:tc>
+      </w:tr>
+      <w:tr>
+        <w:tc>
+          <w:tcPr>
+            <w:tcW w:type="dxa" w:w="4759"/>
+            <w:vAlign w:val="center"/>
+          </w:tcPr>
+          <w:p>
+            <w:pPr>
+              <w:spacing w:after="40" w:before="40"/>
+              <w:jc w:val="left"/>
+            </w:pPr>
+            <w:r>
+              <w:rPr>
+                <w:rFonts w:ascii="Times New Roman" w:hAnsi="Times New Roman" w:eastAsia="Times New Roman"/>
+                <w:b w:val="0"/>
+                <w:i w:val="0"/>
+                <w:color w:val="000000"/>
+                <w:sz w:val="22"/>
+              </w:rPr>
+              <w:t>Quality awareness</w:t>
+            </w:r>
+          </w:p>
+        </w:tc>
+        <w:tc>
+          <w:tcPr>
+            <w:tcW w:type="dxa" w:w="4759"/>
+            <w:vAlign w:val="center"/>
+          </w:tcPr>
+          <w:p>
+            <w:pPr>
+              <w:spacing w:after="40" w:before="40"/>
+              <w:jc w:val="left"/>
+            </w:pPr>
+            <w:r>
+              <w:rPr>
+                <w:rFonts w:ascii="Times New Roman" w:hAnsi="Times New Roman" w:eastAsia="Times New Roman"/>
+                <w:b w:val="0"/>
+                <w:i w:val="0"/>
+                <w:color w:val="000000"/>
+                <w:sz w:val="22"/>
+              </w:rPr>
+              <w:t>Only a small share of Indian construction projects undergo third-party quality audits, highlighting both a gap and an opportunity for firms that prioritise quality assurance [6].</w:t>
+            </w:r>
+          </w:p>
+        </w:tc>
+      </w:tr>
+      <w:tr>
+        <w:tc>
+          <w:tcPr>
+            <w:tcW w:type="dxa" w:w="4759"/>
+            <w:vAlign w:val="center"/>
+            <w:shd w:val="clear" w:fill="EEF2F8"/>
+          </w:tcPr>
+          <w:p>
+            <w:pPr>
+              <w:spacing w:after="40" w:before="40"/>
+              <w:jc w:val="left"/>
+            </w:pPr>
+            <w:r>
+              <w:rPr>
+                <w:rFonts w:ascii="Times New Roman" w:hAnsi="Times New Roman" w:eastAsia="Times New Roman"/>
+                <w:b w:val="0"/>
+                <w:i w:val="0"/>
+                <w:color w:val="000000"/>
+                <w:sz w:val="22"/>
+              </w:rPr>
+              <w:t>Digital adoption</w:t>
+            </w:r>
+          </w:p>
+        </w:tc>
+        <w:tc>
+          <w:tcPr>
+            <w:tcW w:type="dxa" w:w="4759"/>
+            <w:vAlign w:val="center"/>
+            <w:shd w:val="clear" w:fill="EEF2F8"/>
+          </w:tcPr>
+          <w:p>
+            <w:pPr>
+              <w:spacing w:after="40" w:before="40"/>
+              <w:jc w:val="left"/>
+            </w:pPr>
+            <w:r>
+              <w:rPr>
+                <w:rFonts w:ascii="Times New Roman" w:hAnsi="Times New Roman" w:eastAsia="Times New Roman"/>
+                <w:b w:val="0"/>
+                <w:i w:val="0"/>
+                <w:color w:val="000000"/>
+                <w:sz w:val="22"/>
+              </w:rPr>
+              <w:t>Buyers are more comfortable with digital documentation, online updates, and customer portals than ever before.</w:t>
+            </w:r>
+          </w:p>
+        </w:tc>
+      </w:tr>
+      <w:tr>
+        <w:tc>
+          <w:tcPr>
+            <w:tcW w:type="dxa" w:w="4759"/>
+            <w:vAlign w:val="center"/>
+          </w:tcPr>
+          <w:p>
+            <w:pPr>
+              <w:spacing w:after="40" w:before="40"/>
+              <w:jc w:val="left"/>
+            </w:pPr>
+            <w:r>
+              <w:rPr>
+                <w:rFonts w:ascii="Times New Roman" w:hAnsi="Times New Roman" w:eastAsia="Times New Roman"/>
+                <w:b w:val="0"/>
+                <w:i w:val="0"/>
+                <w:color w:val="000000"/>
+                <w:sz w:val="22"/>
+              </w:rPr>
+              <w:t>Sustainability</w:t>
+            </w:r>
+          </w:p>
+        </w:tc>
+        <w:tc>
+          <w:tcPr>
+            <w:tcW w:type="dxa" w:w="4759"/>
+            <w:vAlign w:val="center"/>
+          </w:tcPr>
+          <w:p>
+            <w:pPr>
+              <w:spacing w:after="40" w:before="40"/>
+              <w:jc w:val="left"/>
+            </w:pPr>
+            <w:r>
+              <w:rPr>
+                <w:rFonts w:ascii="Times New Roman" w:hAnsi="Times New Roman" w:eastAsia="Times New Roman"/>
+                <w:b w:val="0"/>
+                <w:i w:val="0"/>
+                <w:color w:val="000000"/>
+                <w:sz w:val="22"/>
+              </w:rPr>
+              <w:t>Green materials, energy efficiency, and smart-home features are gradually shifting from premium add-ons to mainstream expectations.</w:t>
+            </w:r>
+          </w:p>
+        </w:tc>
+      </w:tr>
+    </w:tbl>
     <w:p>
       <w:pPr>
-        <w:pStyle w:val="ListBullet"/>
-        <w:spacing w:after="60"/>
-      </w:pPr>
-      <w:r>
-        <w:rPr>
-          <w:rFonts w:ascii="Times New Roman" w:hAnsi="Times New Roman" w:eastAsia="Times New Roman"/>
-          <w:b/>
-          <w:i w:val="0"/>
-          <w:color w:val="000000"/>
-          <w:sz w:val="24"/>
-        </w:rPr>
-        <w:t>Demand for transparency:</w:t>
-      </w:r>
-      <w:r>
-        <w:rPr>
-          <w:rFonts w:ascii="Times New Roman" w:hAnsi="Times New Roman" w:eastAsia="Times New Roman"/>
-          <w:b w:val="0"/>
-          <w:i w:val="0"/>
-          <w:color w:val="000000"/>
-          <w:sz w:val="24"/>
-        </w:rPr>
-        <w:t xml:space="preserve"> Customers increasingly expect clear pricing, documentation, and regular updates.</w:t>
-      </w:r>
-    </w:p>
-    <w:p>
-      <w:pPr>
-        <w:pStyle w:val="ListBullet"/>
-        <w:spacing w:after="60"/>
-      </w:pPr>
-      <w:r>
-        <w:rPr>
-          <w:rFonts w:ascii="Times New Roman" w:hAnsi="Times New Roman" w:eastAsia="Times New Roman"/>
-          <w:b/>
-          <w:i w:val="0"/>
-          <w:color w:val="000000"/>
-          <w:sz w:val="24"/>
-        </w:rPr>
-        <w:t>Rising input costs:</w:t>
-      </w:r>
-      <w:r>
-        <w:rPr>
-          <w:rFonts w:ascii="Times New Roman" w:hAnsi="Times New Roman" w:eastAsia="Times New Roman"/>
-          <w:b w:val="0"/>
-          <w:i w:val="0"/>
-          <w:color w:val="000000"/>
-          <w:sz w:val="24"/>
-        </w:rPr>
-        <w:t xml:space="preserve"> Construction costs are projected to rise by around 3–5% in 2026, driven largely by labour cost inflation, making accurate estimation and disciplined project management essential [5].</w:t>
-      </w:r>
-    </w:p>
-    <w:p>
-      <w:pPr>
-        <w:pStyle w:val="ListBullet"/>
-        <w:spacing w:after="60"/>
-      </w:pPr>
-      <w:r>
-        <w:rPr>
-          <w:rFonts w:ascii="Times New Roman" w:hAnsi="Times New Roman" w:eastAsia="Times New Roman"/>
-          <w:b/>
-          <w:i w:val="0"/>
-          <w:color w:val="000000"/>
-          <w:sz w:val="24"/>
-        </w:rPr>
-        <w:t>Quality awareness:</w:t>
-      </w:r>
-      <w:r>
-        <w:rPr>
-          <w:rFonts w:ascii="Times New Roman" w:hAnsi="Times New Roman" w:eastAsia="Times New Roman"/>
-          <w:b w:val="0"/>
-          <w:i w:val="0"/>
-          <w:color w:val="000000"/>
-          <w:sz w:val="24"/>
-        </w:rPr>
-        <w:t xml:space="preserve"> Independent analyses note that only a small share of Indian construction projects undergo third-party quality audits, highlighting both a gap and an opportunity for firms that prioritise quality assurance [6].</w:t>
-      </w:r>
-    </w:p>
-    <w:p>
-      <w:pPr>
-        <w:pStyle w:val="ListBullet"/>
-        <w:spacing w:after="60"/>
-      </w:pPr>
-      <w:r>
-        <w:rPr>
-          <w:rFonts w:ascii="Times New Roman" w:hAnsi="Times New Roman" w:eastAsia="Times New Roman"/>
-          <w:b/>
-          <w:i w:val="0"/>
-          <w:color w:val="000000"/>
-          <w:sz w:val="24"/>
-        </w:rPr>
-        <w:t>Digital adoption:</w:t>
-      </w:r>
-      <w:r>
-        <w:rPr>
-          <w:rFonts w:ascii="Times New Roman" w:hAnsi="Times New Roman" w:eastAsia="Times New Roman"/>
-          <w:b w:val="0"/>
-          <w:i w:val="0"/>
-          <w:color w:val="000000"/>
-          <w:sz w:val="24"/>
-        </w:rPr>
-        <w:t xml:space="preserve"> Buyers are more comfortable with digital documentation, online updates, and customer portals than ever before.</w:t>
-      </w:r>
-    </w:p>
-    <w:p>
-      <w:pPr>
-        <w:pStyle w:val="ListBullet"/>
-        <w:spacing w:after="60"/>
-      </w:pPr>
-      <w:r>
-        <w:rPr>
-          <w:rFonts w:ascii="Times New Roman" w:hAnsi="Times New Roman" w:eastAsia="Times New Roman"/>
-          <w:b/>
-          <w:i w:val="0"/>
-          <w:color w:val="000000"/>
-          <w:sz w:val="24"/>
-        </w:rPr>
-        <w:t>Sustainability:</w:t>
-      </w:r>
-      <w:r>
-        <w:rPr>
-          <w:rFonts w:ascii="Times New Roman" w:hAnsi="Times New Roman" w:eastAsia="Times New Roman"/>
-          <w:b w:val="0"/>
-          <w:i w:val="0"/>
-          <w:color w:val="000000"/>
-          <w:sz w:val="24"/>
-        </w:rPr>
-        <w:t xml:space="preserve"> Green materials, energy efficiency, and smart-home features are gradually shifting from premium add-ons to mainstream expectations.</w:t>
-      </w:r>
+        <w:spacing w:after="80"/>
+      </w:pPr>
     </w:p>
     <w:p>
       <w:pPr>
@@ -5160,135 +5672,315 @@
         <w:t>BuildWise offers an integrated portfolio of construction services, allowing customers to work with a single trusted partner across the project lifecycle.</w:t>
       </w:r>
     </w:p>
+    <w:tbl>
+      <w:tblPr>
+        <w:tblStyle w:val="TableGrid"/>
+        <w:tblW w:type="auto" w:w="0"/>
+        <w:jc w:val="center"/>
+        <w:tblLook w:firstColumn="1" w:firstRow="1" w:lastColumn="0" w:lastRow="0" w:noHBand="0" w:noVBand="1" w:val="04A0"/>
+        <w:tblCellMar>
+          <w:top w:w="60" w:type="dxa"/>
+          <w:bottom w:w="60" w:type="dxa"/>
+          <w:start w:w="110" w:type="dxa"/>
+          <w:end w:w="110" w:type="dxa"/>
+          <w:left w:w="110" w:type="dxa"/>
+          <w:right w:w="110" w:type="dxa"/>
+        </w:tblCellMar>
+      </w:tblPr>
+      <w:tblGrid>
+        <w:gridCol w:w="4759"/>
+        <w:gridCol w:w="4759"/>
+      </w:tblGrid>
+      <w:tr>
+        <w:trPr>
+          <w:tblHeader w:val="true"/>
+        </w:trPr>
+        <w:tc>
+          <w:tcPr>
+            <w:tcW w:type="dxa" w:w="4759"/>
+            <w:vAlign w:val="center"/>
+            <w:shd w:val="clear" w:fill="163A6B"/>
+          </w:tcPr>
+          <w:p>
+            <w:pPr>
+              <w:spacing w:after="40" w:before="40"/>
+              <w:jc w:val="left"/>
+            </w:pPr>
+            <w:r>
+              <w:rPr>
+                <w:rFonts w:ascii="Cambria" w:hAnsi="Cambria" w:eastAsia="Cambria"/>
+                <w:b/>
+                <w:i w:val="0"/>
+                <w:color w:val="FFFFFF"/>
+                <w:sz w:val="22"/>
+              </w:rPr>
+              <w:t>Service</w:t>
+            </w:r>
+          </w:p>
+        </w:tc>
+        <w:tc>
+          <w:tcPr>
+            <w:tcW w:type="dxa" w:w="4759"/>
+            <w:vAlign w:val="center"/>
+            <w:shd w:val="clear" w:fill="163A6B"/>
+          </w:tcPr>
+          <w:p>
+            <w:pPr>
+              <w:spacing w:after="40" w:before="40"/>
+              <w:jc w:val="left"/>
+            </w:pPr>
+            <w:r>
+              <w:rPr>
+                <w:rFonts w:ascii="Cambria" w:hAnsi="Cambria" w:eastAsia="Cambria"/>
+                <w:b/>
+                <w:i w:val="0"/>
+                <w:color w:val="FFFFFF"/>
+                <w:sz w:val="22"/>
+              </w:rPr>
+              <w:t>Description</w:t>
+            </w:r>
+          </w:p>
+        </w:tc>
+      </w:tr>
+      <w:tr>
+        <w:tc>
+          <w:tcPr>
+            <w:tcW w:type="dxa" w:w="4759"/>
+            <w:vAlign w:val="center"/>
+          </w:tcPr>
+          <w:p>
+            <w:pPr>
+              <w:spacing w:after="40" w:before="40"/>
+              <w:jc w:val="left"/>
+            </w:pPr>
+            <w:r>
+              <w:rPr>
+                <w:rFonts w:ascii="Times New Roman" w:hAnsi="Times New Roman" w:eastAsia="Times New Roman"/>
+                <w:b w:val="0"/>
+                <w:i w:val="0"/>
+                <w:color w:val="000000"/>
+                <w:sz w:val="22"/>
+              </w:rPr>
+              <w:t>Residential Construction</w:t>
+            </w:r>
+          </w:p>
+        </w:tc>
+        <w:tc>
+          <w:tcPr>
+            <w:tcW w:type="dxa" w:w="4759"/>
+            <w:vAlign w:val="center"/>
+          </w:tcPr>
+          <w:p>
+            <w:pPr>
+              <w:spacing w:after="40" w:before="40"/>
+              <w:jc w:val="left"/>
+            </w:pPr>
+            <w:r>
+              <w:rPr>
+                <w:rFonts w:ascii="Times New Roman" w:hAnsi="Times New Roman" w:eastAsia="Times New Roman"/>
+                <w:b w:val="0"/>
+                <w:i w:val="0"/>
+                <w:color w:val="000000"/>
+                <w:sz w:val="22"/>
+              </w:rPr>
+              <w:t>Independent houses, villas, and small apartment units built to customer requirements.</w:t>
+            </w:r>
+          </w:p>
+        </w:tc>
+      </w:tr>
+      <w:tr>
+        <w:tc>
+          <w:tcPr>
+            <w:tcW w:type="dxa" w:w="4759"/>
+            <w:vAlign w:val="center"/>
+            <w:shd w:val="clear" w:fill="EEF2F8"/>
+          </w:tcPr>
+          <w:p>
+            <w:pPr>
+              <w:spacing w:after="40" w:before="40"/>
+              <w:jc w:val="left"/>
+            </w:pPr>
+            <w:r>
+              <w:rPr>
+                <w:rFonts w:ascii="Times New Roman" w:hAnsi="Times New Roman" w:eastAsia="Times New Roman"/>
+                <w:b w:val="0"/>
+                <w:i w:val="0"/>
+                <w:color w:val="000000"/>
+                <w:sz w:val="22"/>
+              </w:rPr>
+              <w:t>Commercial Construction</w:t>
+            </w:r>
+          </w:p>
+        </w:tc>
+        <w:tc>
+          <w:tcPr>
+            <w:tcW w:type="dxa" w:w="4759"/>
+            <w:vAlign w:val="center"/>
+            <w:shd w:val="clear" w:fill="EEF2F8"/>
+          </w:tcPr>
+          <w:p>
+            <w:pPr>
+              <w:spacing w:after="40" w:before="40"/>
+              <w:jc w:val="left"/>
+            </w:pPr>
+            <w:r>
+              <w:rPr>
+                <w:rFonts w:ascii="Times New Roman" w:hAnsi="Times New Roman" w:eastAsia="Times New Roman"/>
+                <w:b w:val="0"/>
+                <w:i w:val="0"/>
+                <w:color w:val="000000"/>
+                <w:sz w:val="22"/>
+              </w:rPr>
+              <w:t>Offices, retail spaces, and small commercial buildings.</w:t>
+            </w:r>
+          </w:p>
+        </w:tc>
+      </w:tr>
+      <w:tr>
+        <w:tc>
+          <w:tcPr>
+            <w:tcW w:type="dxa" w:w="4759"/>
+            <w:vAlign w:val="center"/>
+          </w:tcPr>
+          <w:p>
+            <w:pPr>
+              <w:spacing w:after="40" w:before="40"/>
+              <w:jc w:val="left"/>
+            </w:pPr>
+            <w:r>
+              <w:rPr>
+                <w:rFonts w:ascii="Times New Roman" w:hAnsi="Times New Roman" w:eastAsia="Times New Roman"/>
+                <w:b w:val="0"/>
+                <w:i w:val="0"/>
+                <w:color w:val="000000"/>
+                <w:sz w:val="22"/>
+              </w:rPr>
+              <w:t>Renovation</w:t>
+            </w:r>
+          </w:p>
+        </w:tc>
+        <w:tc>
+          <w:tcPr>
+            <w:tcW w:type="dxa" w:w="4759"/>
+            <w:vAlign w:val="center"/>
+          </w:tcPr>
+          <w:p>
+            <w:pPr>
+              <w:spacing w:after="40" w:before="40"/>
+              <w:jc w:val="left"/>
+            </w:pPr>
+            <w:r>
+              <w:rPr>
+                <w:rFonts w:ascii="Times New Roman" w:hAnsi="Times New Roman" w:eastAsia="Times New Roman"/>
+                <w:b w:val="0"/>
+                <w:i w:val="0"/>
+                <w:color w:val="000000"/>
+                <w:sz w:val="22"/>
+              </w:rPr>
+              <w:t>Structural and cosmetic renovation of existing residential and commercial properties.</w:t>
+            </w:r>
+          </w:p>
+        </w:tc>
+      </w:tr>
+      <w:tr>
+        <w:tc>
+          <w:tcPr>
+            <w:tcW w:type="dxa" w:w="4759"/>
+            <w:vAlign w:val="center"/>
+            <w:shd w:val="clear" w:fill="EEF2F8"/>
+          </w:tcPr>
+          <w:p>
+            <w:pPr>
+              <w:spacing w:after="40" w:before="40"/>
+              <w:jc w:val="left"/>
+            </w:pPr>
+            <w:r>
+              <w:rPr>
+                <w:rFonts w:ascii="Times New Roman" w:hAnsi="Times New Roman" w:eastAsia="Times New Roman"/>
+                <w:b w:val="0"/>
+                <w:i w:val="0"/>
+                <w:color w:val="000000"/>
+                <w:sz w:val="22"/>
+              </w:rPr>
+              <w:t>Interior Works</w:t>
+            </w:r>
+          </w:p>
+        </w:tc>
+        <w:tc>
+          <w:tcPr>
+            <w:tcW w:type="dxa" w:w="4759"/>
+            <w:vAlign w:val="center"/>
+            <w:shd w:val="clear" w:fill="EEF2F8"/>
+          </w:tcPr>
+          <w:p>
+            <w:pPr>
+              <w:spacing w:after="40" w:before="40"/>
+              <w:jc w:val="left"/>
+            </w:pPr>
+            <w:r>
+              <w:rPr>
+                <w:rFonts w:ascii="Times New Roman" w:hAnsi="Times New Roman" w:eastAsia="Times New Roman"/>
+                <w:b w:val="0"/>
+                <w:i w:val="0"/>
+                <w:color w:val="000000"/>
+                <w:sz w:val="22"/>
+              </w:rPr>
+              <w:t>Interior design and execution, including modular kitchens, wardrobes, false ceilings, flooring, and finishing.</w:t>
+            </w:r>
+          </w:p>
+        </w:tc>
+      </w:tr>
+      <w:tr>
+        <w:tc>
+          <w:tcPr>
+            <w:tcW w:type="dxa" w:w="4759"/>
+            <w:vAlign w:val="center"/>
+          </w:tcPr>
+          <w:p>
+            <w:pPr>
+              <w:spacing w:after="40" w:before="40"/>
+              <w:jc w:val="left"/>
+            </w:pPr>
+            <w:r>
+              <w:rPr>
+                <w:rFonts w:ascii="Times New Roman" w:hAnsi="Times New Roman" w:eastAsia="Times New Roman"/>
+                <w:b w:val="0"/>
+                <w:i w:val="0"/>
+                <w:color w:val="000000"/>
+                <w:sz w:val="22"/>
+              </w:rPr>
+              <w:t>Turnkey Projects</w:t>
+            </w:r>
+          </w:p>
+        </w:tc>
+        <w:tc>
+          <w:tcPr>
+            <w:tcW w:type="dxa" w:w="4759"/>
+            <w:vAlign w:val="center"/>
+          </w:tcPr>
+          <w:p>
+            <w:pPr>
+              <w:spacing w:after="40" w:before="40"/>
+              <w:jc w:val="left"/>
+            </w:pPr>
+            <w:r>
+              <w:rPr>
+                <w:rFonts w:ascii="Times New Roman" w:hAnsi="Times New Roman" w:eastAsia="Times New Roman"/>
+                <w:b w:val="0"/>
+                <w:i w:val="0"/>
+                <w:color w:val="000000"/>
+                <w:sz w:val="22"/>
+              </w:rPr>
+              <w:t>End-to-end delivery from design and approvals to final handover, ideal for busy customers and NRIs.</w:t>
+            </w:r>
+          </w:p>
+        </w:tc>
+      </w:tr>
+    </w:tbl>
     <w:p>
       <w:pPr>
-        <w:pStyle w:val="ListBullet"/>
-        <w:spacing w:after="60"/>
-      </w:pPr>
-      <w:r>
-        <w:rPr>
-          <w:rFonts w:ascii="Times New Roman" w:hAnsi="Times New Roman" w:eastAsia="Times New Roman"/>
-          <w:b/>
-          <w:i w:val="0"/>
-          <w:color w:val="000000"/>
-          <w:sz w:val="24"/>
-        </w:rPr>
-        <w:t>Residential Construction:</w:t>
-      </w:r>
-      <w:r>
-        <w:rPr>
-          <w:rFonts w:ascii="Times New Roman" w:hAnsi="Times New Roman" w:eastAsia="Times New Roman"/>
-          <w:b w:val="0"/>
-          <w:i w:val="0"/>
-          <w:color w:val="000000"/>
-          <w:sz w:val="24"/>
-        </w:rPr>
-        <w:t xml:space="preserve"> Independent houses, villas, and small apartment units built to customer requirements.</w:t>
-      </w:r>
-    </w:p>
-    <w:p>
-      <w:pPr>
-        <w:pStyle w:val="ListBullet"/>
-        <w:spacing w:after="60"/>
-      </w:pPr>
-      <w:r>
-        <w:rPr>
-          <w:rFonts w:ascii="Times New Roman" w:hAnsi="Times New Roman" w:eastAsia="Times New Roman"/>
-          <w:b/>
-          <w:i w:val="0"/>
-          <w:color w:val="000000"/>
-          <w:sz w:val="24"/>
-        </w:rPr>
-        <w:t>Commercial Construction:</w:t>
-      </w:r>
-      <w:r>
-        <w:rPr>
-          <w:rFonts w:ascii="Times New Roman" w:hAnsi="Times New Roman" w:eastAsia="Times New Roman"/>
-          <w:b w:val="0"/>
-          <w:i w:val="0"/>
-          <w:color w:val="000000"/>
-          <w:sz w:val="24"/>
-        </w:rPr>
-        <w:t xml:space="preserve"> Offices, retail spaces, and small commercial buildings.</w:t>
-      </w:r>
-    </w:p>
-    <w:p>
-      <w:pPr>
-        <w:pStyle w:val="ListBullet"/>
-        <w:spacing w:after="60"/>
-      </w:pPr>
-      <w:r>
-        <w:rPr>
-          <w:rFonts w:ascii="Times New Roman" w:hAnsi="Times New Roman" w:eastAsia="Times New Roman"/>
-          <w:b/>
-          <w:i w:val="0"/>
-          <w:color w:val="000000"/>
-          <w:sz w:val="24"/>
-        </w:rPr>
-        <w:t>Renovation:</w:t>
-      </w:r>
-      <w:r>
-        <w:rPr>
-          <w:rFonts w:ascii="Times New Roman" w:hAnsi="Times New Roman" w:eastAsia="Times New Roman"/>
-          <w:b w:val="0"/>
-          <w:i w:val="0"/>
-          <w:color w:val="000000"/>
-          <w:sz w:val="24"/>
-        </w:rPr>
-        <w:t xml:space="preserve"> Structural and cosmetic renovation of existing residential and commercial properties.</w:t>
-      </w:r>
-    </w:p>
-    <w:p>
-      <w:pPr>
-        <w:pStyle w:val="ListBullet"/>
-        <w:spacing w:after="60"/>
-      </w:pPr>
-      <w:r>
-        <w:rPr>
-          <w:rFonts w:ascii="Times New Roman" w:hAnsi="Times New Roman" w:eastAsia="Times New Roman"/>
-          <w:b/>
-          <w:i w:val="0"/>
-          <w:color w:val="000000"/>
-          <w:sz w:val="24"/>
-        </w:rPr>
-        <w:t>Interior Works:</w:t>
-      </w:r>
-      <w:r>
-        <w:rPr>
-          <w:rFonts w:ascii="Times New Roman" w:hAnsi="Times New Roman" w:eastAsia="Times New Roman"/>
-          <w:b w:val="0"/>
-          <w:i w:val="0"/>
-          <w:color w:val="000000"/>
-          <w:sz w:val="24"/>
-        </w:rPr>
-        <w:t xml:space="preserve"> Interior design and execution, including modular kitchens, wardrobes, false ceilings, flooring, and finishing.</w:t>
-      </w:r>
-    </w:p>
-    <w:p>
-      <w:pPr>
-        <w:pStyle w:val="ListBullet"/>
-        <w:spacing w:after="60"/>
-      </w:pPr>
-      <w:r>
-        <w:rPr>
-          <w:rFonts w:ascii="Times New Roman" w:hAnsi="Times New Roman" w:eastAsia="Times New Roman"/>
-          <w:b/>
-          <w:i w:val="0"/>
-          <w:color w:val="000000"/>
-          <w:sz w:val="24"/>
-        </w:rPr>
-        <w:t>Turnkey Projects:</w:t>
-      </w:r>
-      <w:r>
-        <w:rPr>
-          <w:rFonts w:ascii="Times New Roman" w:hAnsi="Times New Roman" w:eastAsia="Times New Roman"/>
-          <w:b w:val="0"/>
-          <w:i w:val="0"/>
-          <w:color w:val="000000"/>
-          <w:sz w:val="24"/>
-        </w:rPr>
-        <w:t xml:space="preserve"> End-to-end delivery from design and approvals to final handover, ideal for busy customers and NRIs.</w:t>
-      </w:r>
+        <w:spacing w:after="80"/>
+      </w:pPr>
     </w:p>
     <w:p>
       <w:pPr>
@@ -5430,28 +6122,72 @@
           <w:color w:val="000000"/>
           <w:sz w:val="24"/>
         </w:rPr>
-        <w:t xml:space="preserve">BuildWise follows a disciplined, phased business model. The central principle is that </w:t>
-      </w:r>
-      <w:r>
-        <w:rPr>
-          <w:rFonts w:ascii="Times New Roman" w:hAnsi="Times New Roman" w:eastAsia="Times New Roman"/>
-          <w:b/>
-          <w:i w:val="0"/>
-          <w:color w:val="000000"/>
-          <w:sz w:val="24"/>
-        </w:rPr>
-        <w:t>technology is introduced only after the business can realistically afford it.</w:t>
-      </w:r>
-      <w:r>
-        <w:rPr>
-          <w:rFonts w:ascii="Times New Roman" w:hAnsi="Times New Roman" w:eastAsia="Times New Roman"/>
-          <w:b w:val="0"/>
-          <w:i w:val="0"/>
-          <w:color w:val="000000"/>
-          <w:sz w:val="24"/>
-        </w:rPr>
-        <w:t xml:space="preserve"> The company grows in the following sequence:</w:t>
-      </w:r>
+        <w:t>BuildWise follows a disciplined, phased business model in which the company grows in a deliberate sequence, summarised below.</w:t>
+      </w:r>
+    </w:p>
+    <w:tbl>
+      <w:tblPr>
+        <w:tblW w:type="auto" w:w="0"/>
+        <w:jc w:val="center"/>
+        <w:tblLook w:firstColumn="1" w:firstRow="1" w:lastColumn="0" w:lastRow="0" w:noHBand="0" w:noVBand="1" w:val="04A0"/>
+        <w:tblCellMar>
+          <w:top w:w="110" w:type="dxa"/>
+          <w:bottom w:w="110" w:type="dxa"/>
+          <w:start w:w="180" w:type="dxa"/>
+          <w:end w:w="150" w:type="dxa"/>
+          <w:left w:w="180" w:type="dxa"/>
+          <w:right w:w="150" w:type="dxa"/>
+        </w:tblCellMar>
+      </w:tblPr>
+      <w:tblGrid>
+        <w:gridCol w:w="9518"/>
+      </w:tblGrid>
+      <w:tr>
+        <w:tc>
+          <w:tcPr>
+            <w:tcW w:type="dxa" w:w="9518"/>
+            <w:shd w:val="clear" w:fill="EEF2F8"/>
+            <w:tcBorders>
+              <w:left w:val="single" w:sz="30" w:space="0" w:color="163A6B"/>
+            </w:tcBorders>
+          </w:tcPr>
+          <w:p>
+            <w:pPr>
+              <w:spacing w:after="40"/>
+            </w:pPr>
+            <w:r>
+              <w:rPr>
+                <w:rFonts w:ascii="Cambria" w:hAnsi="Cambria" w:eastAsia="Cambria"/>
+                <w:b/>
+                <w:i w:val="0"/>
+                <w:color w:val="163A6B"/>
+                <w:sz w:val="24"/>
+              </w:rPr>
+              <w:t>Key Principle</w:t>
+            </w:r>
+          </w:p>
+          <w:p>
+            <w:pPr>
+              <w:spacing w:after="0"/>
+            </w:pPr>
+            <w:r>
+              <w:rPr>
+                <w:rFonts w:ascii="Times New Roman" w:hAnsi="Times New Roman" w:eastAsia="Times New Roman"/>
+                <w:b w:val="0"/>
+                <w:i w:val="0"/>
+                <w:color w:val="000000"/>
+                <w:sz w:val="23"/>
+              </w:rPr>
+              <w:t>Technology is introduced only after the business can realistically afford it.</w:t>
+            </w:r>
+          </w:p>
+        </w:tc>
+      </w:tr>
+    </w:tbl>
+    <w:p>
+      <w:pPr>
+        <w:spacing w:after="80"/>
+      </w:pPr>
     </w:p>
     <w:p>
       <w:pPr>

</xml_diff>

<commit_message>
Polish pass: Key Insights boxes after diagrams, enlarged org chart, financial metrics cards, Final Takeaway box, descriptive figure captions, balanced diagram+box pages
</commit_message>
<xml_diff>
--- a/BuildWise-Business-Plan/BuildWise_Business_Plan_Report.docx
+++ b/BuildWise-Business-Plan/BuildWise_Business_Plan_Report.docx
@@ -1428,7 +1428,7 @@
                 <w:color w:val="000000"/>
                 <w:sz w:val="24"/>
               </w:rPr>
-              <w:t>21</w:t>
+              <w:t>22</w:t>
             </w:r>
           </w:p>
         </w:tc>
@@ -1496,7 +1496,7 @@
                 <w:color w:val="000000"/>
                 <w:sz w:val="24"/>
               </w:rPr>
-              <w:t>22</w:t>
+              <w:t>23</w:t>
             </w:r>
           </w:p>
         </w:tc>
@@ -1567,7 +1567,7 @@
                 <w:color w:val="000000"/>
                 <w:sz w:val="24"/>
               </w:rPr>
-              <w:t>24</w:t>
+              <w:t>25</w:t>
             </w:r>
           </w:p>
         </w:tc>
@@ -1635,7 +1635,7 @@
                 <w:color w:val="000000"/>
                 <w:sz w:val="24"/>
               </w:rPr>
-              <w:t>29</w:t>
+              <w:t>30</w:t>
             </w:r>
           </w:p>
         </w:tc>
@@ -1706,7 +1706,7 @@
                 <w:color w:val="000000"/>
                 <w:sz w:val="24"/>
               </w:rPr>
-              <w:t>30</w:t>
+              <w:t>31</w:t>
             </w:r>
           </w:p>
         </w:tc>
@@ -1774,7 +1774,7 @@
                 <w:color w:val="000000"/>
                 <w:sz w:val="24"/>
               </w:rPr>
-              <w:t>31</w:t>
+              <w:t>33</w:t>
             </w:r>
           </w:p>
         </w:tc>
@@ -1845,7 +1845,7 @@
                 <w:color w:val="000000"/>
                 <w:sz w:val="24"/>
               </w:rPr>
-              <w:t>33</w:t>
+              <w:t>35</w:t>
             </w:r>
           </w:p>
         </w:tc>
@@ -1913,7 +1913,7 @@
                 <w:color w:val="000000"/>
                 <w:sz w:val="24"/>
               </w:rPr>
-              <w:t>34</w:t>
+              <w:t>36</w:t>
             </w:r>
           </w:p>
         </w:tc>
@@ -1984,7 +1984,7 @@
                 <w:color w:val="000000"/>
                 <w:sz w:val="24"/>
               </w:rPr>
-              <w:t>35</w:t>
+              <w:t>38</w:t>
             </w:r>
           </w:p>
         </w:tc>
@@ -3641,7 +3641,7 @@
           <w:color w:val="595959"/>
           <w:sz w:val="22"/>
         </w:rPr>
-        <w:t>Figure 1: Size of the Indian construction market and its residential segment in 2025.</w:t>
+        <w:t>Figure 1. Size of the Indian construction market and its residential segment in 2025.</w:t>
       </w:r>
     </w:p>
     <w:p>
@@ -5446,7 +5446,7 @@
           <w:color w:val="595959"/>
           <w:sz w:val="22"/>
         </w:rPr>
-        <w:t>Figure 2: How BuildWise converts common industry problems into concrete, customer-facing solutions.</w:t>
+        <w:t>Figure 2. How BuildWise converts common industry problems into concrete, customer-facing solutions.</w:t>
       </w:r>
     </w:p>
     <w:p>
@@ -6088,6 +6088,87 @@
         <w:t>Each service is delivered with the same underlying commitments: transparent pricing, milestone billing, quality checkpoints, structured documentation, and after-sales support. This consistency is what converts first-time customers into long-term references.</w:t>
       </w:r>
     </w:p>
+    <w:tbl>
+      <w:tblPr>
+        <w:tblW w:type="auto" w:w="0"/>
+        <w:jc w:val="center"/>
+        <w:tblLook w:firstColumn="1" w:firstRow="1" w:lastColumn="0" w:lastRow="0" w:noHBand="0" w:noVBand="1" w:val="04A0"/>
+        <w:tblCellMar>
+          <w:top w:w="110" w:type="dxa"/>
+          <w:bottom w:w="110" w:type="dxa"/>
+          <w:start w:w="180" w:type="dxa"/>
+          <w:end w:w="150" w:type="dxa"/>
+          <w:left w:w="180" w:type="dxa"/>
+          <w:right w:w="150" w:type="dxa"/>
+        </w:tblCellMar>
+      </w:tblPr>
+      <w:tblGrid>
+        <w:gridCol w:w="9518"/>
+      </w:tblGrid>
+      <w:tr>
+        <w:tc>
+          <w:tcPr>
+            <w:tcW w:type="dxa" w:w="9518"/>
+            <w:shd w:val="clear" w:fill="EEF2F8"/>
+            <w:tcBorders>
+              <w:left w:val="single" w:sz="30" w:space="0" w:color="163A6B"/>
+            </w:tcBorders>
+          </w:tcPr>
+          <w:p>
+            <w:pPr>
+              <w:spacing w:after="60"/>
+            </w:pPr>
+            <w:r>
+              <w:rPr>
+                <w:rFonts w:ascii="Cambria" w:hAnsi="Cambria" w:eastAsia="Cambria"/>
+                <w:b/>
+                <w:i w:val="0"/>
+                <w:color w:val="163A6B"/>
+                <w:sz w:val="24"/>
+              </w:rPr>
+              <w:t>Business Insight</w:t>
+            </w:r>
+          </w:p>
+          <w:p>
+            <w:pPr>
+              <w:spacing w:after="40"/>
+              <w:ind w:left="170"/>
+            </w:pPr>
+            <w:r>
+              <w:rPr>
+                <w:rFonts w:ascii="Times New Roman" w:hAnsi="Times New Roman" w:eastAsia="Times New Roman"/>
+                <w:b w:val="0"/>
+                <w:i w:val="0"/>
+                <w:color w:val="000000"/>
+                <w:sz w:val="22"/>
+              </w:rPr>
+              <w:t>•  Covering the full project lifecycle lets customers work with a single trusted partner.</w:t>
+            </w:r>
+          </w:p>
+          <w:p>
+            <w:pPr>
+              <w:spacing w:after="40"/>
+              <w:ind w:left="170"/>
+            </w:pPr>
+            <w:r>
+              <w:rPr>
+                <w:rFonts w:ascii="Times New Roman" w:hAnsi="Times New Roman" w:eastAsia="Times New Roman"/>
+                <w:b w:val="0"/>
+                <w:i w:val="0"/>
+                <w:color w:val="000000"/>
+                <w:sz w:val="22"/>
+              </w:rPr>
+              <w:t>•  Consistent commitments across every service turn first-time clients into long-term references.</w:t>
+            </w:r>
+          </w:p>
+        </w:tc>
+      </w:tr>
+    </w:tbl>
+    <w:p>
+      <w:pPr>
+        <w:spacing w:after="80"/>
+      </w:pPr>
+    </w:p>
     <w:p>
       <w:r>
         <w:br w:type="page"/>
@@ -6243,7 +6324,7 @@
           <w:color w:val="595959"/>
           <w:sz w:val="22"/>
         </w:rPr>
-        <w:t>Figure 3: The BuildWise growth sequence — reputation and revenue are established first, with technology and expansion introduced only once the business can support them.</w:t>
+        <w:t>Figure 3. The BuildWise growth sequence — reputation and revenue are established first, with technology and expansion introduced only once the business can support them.</w:t>
       </w:r>
     </w:p>
     <w:p>
@@ -6912,7 +6993,7 @@
           <w:color w:val="595959"/>
           <w:sz w:val="22"/>
         </w:rPr>
-        <w:t>Figure 4: The four-phase BuildWise business model, in which each phase is funded by the success of the phase before it.</w:t>
+        <w:t>Figure 4. The four-phase BuildWise business model, in which each phase is funded by the success of the phase before it.</w:t>
       </w:r>
     </w:p>
     <w:p>
@@ -8023,7 +8104,7 @@
       <w:r>
         <w:drawing>
           <wp:inline xmlns:a="http://schemas.openxmlformats.org/drawingml/2006/main" xmlns:pic="http://schemas.openxmlformats.org/drawingml/2006/picture">
-            <wp:extent cx="5852160" cy="4486104"/>
+            <wp:extent cx="5487075" cy="4206240"/>
             <wp:docPr id="5" name="Picture 5"/>
             <wp:cNvGraphicFramePr>
               <a:graphicFrameLocks noChangeAspect="1"/>
@@ -8044,7 +8125,7 @@
                   <pic:spPr>
                     <a:xfrm>
                       <a:off x="0" y="0"/>
-                      <a:ext cx="5852160" cy="4486104"/>
+                      <a:ext cx="5487075" cy="4206240"/>
                     </a:xfrm>
                     <a:prstGeom prst="rect"/>
                   </pic:spPr>
@@ -8068,8 +8149,89 @@
           <w:color w:val="595959"/>
           <w:sz w:val="22"/>
         </w:rPr>
-        <w:t>Figure 5: SWOT analysis of BuildWise Constructions Pvt. Ltd., summarising internal strengths and weaknesses alongside external opportunities and threats.</w:t>
+        <w:t>Figure 5. SWOT analysis of BuildWise Constructions Pvt. Ltd., summarising internal strengths and weaknesses alongside external opportunities and threats.</w:t>
       </w:r>
+    </w:p>
+    <w:tbl>
+      <w:tblPr>
+        <w:tblW w:type="auto" w:w="0"/>
+        <w:jc w:val="center"/>
+        <w:tblLook w:firstColumn="1" w:firstRow="1" w:lastColumn="0" w:lastRow="0" w:noHBand="0" w:noVBand="1" w:val="04A0"/>
+        <w:tblCellMar>
+          <w:top w:w="110" w:type="dxa"/>
+          <w:bottom w:w="110" w:type="dxa"/>
+          <w:start w:w="180" w:type="dxa"/>
+          <w:end w:w="150" w:type="dxa"/>
+          <w:left w:w="180" w:type="dxa"/>
+          <w:right w:w="150" w:type="dxa"/>
+        </w:tblCellMar>
+      </w:tblPr>
+      <w:tblGrid>
+        <w:gridCol w:w="9518"/>
+      </w:tblGrid>
+      <w:tr>
+        <w:tc>
+          <w:tcPr>
+            <w:tcW w:type="dxa" w:w="9518"/>
+            <w:shd w:val="clear" w:fill="EEF2F8"/>
+            <w:tcBorders>
+              <w:left w:val="single" w:sz="30" w:space="0" w:color="163A6B"/>
+            </w:tcBorders>
+          </w:tcPr>
+          <w:p>
+            <w:pPr>
+              <w:spacing w:after="60"/>
+            </w:pPr>
+            <w:r>
+              <w:rPr>
+                <w:rFonts w:ascii="Cambria" w:hAnsi="Cambria" w:eastAsia="Cambria"/>
+                <w:b/>
+                <w:i w:val="0"/>
+                <w:color w:val="163A6B"/>
+                <w:sz w:val="24"/>
+              </w:rPr>
+              <w:t>Strategic Insight</w:t>
+            </w:r>
+          </w:p>
+          <w:p>
+            <w:pPr>
+              <w:spacing w:after="40"/>
+              <w:ind w:left="170"/>
+            </w:pPr>
+            <w:r>
+              <w:rPr>
+                <w:rFonts w:ascii="Times New Roman" w:hAnsi="Times New Roman" w:eastAsia="Times New Roman"/>
+                <w:b w:val="0"/>
+                <w:i w:val="0"/>
+                <w:color w:val="000000"/>
+                <w:sz w:val="22"/>
+              </w:rPr>
+              <w:t>•  BuildWise converts transparency and service quality into a genuine competitive edge.</w:t>
+            </w:r>
+          </w:p>
+          <w:p>
+            <w:pPr>
+              <w:spacing w:after="40"/>
+              <w:ind w:left="170"/>
+            </w:pPr>
+            <w:r>
+              <w:rPr>
+                <w:rFonts w:ascii="Times New Roman" w:hAnsi="Times New Roman" w:eastAsia="Times New Roman"/>
+                <w:b w:val="0"/>
+                <w:i w:val="0"/>
+                <w:color w:val="000000"/>
+                <w:sz w:val="22"/>
+              </w:rPr>
+              <w:t>•  Its main threats — cost inflation and local competition — are managed through disciplined estimation and phased growth.</w:t>
+            </w:r>
+          </w:p>
+        </w:tc>
+      </w:tr>
+    </w:tbl>
+    <w:p>
+      <w:pPr>
+        <w:spacing w:after="80"/>
+      </w:pPr>
     </w:p>
     <w:p>
       <w:r>
@@ -8426,8 +8588,89 @@
           <w:color w:val="595959"/>
           <w:sz w:val="22"/>
         </w:rPr>
-        <w:t>Figure 6: BuildWise's customer-acquisition funnel, from initial awareness to long-term advocacy.</w:t>
+        <w:t>Figure 6. BuildWise's customer-acquisition funnel, from initial awareness to long-term advocacy.</w:t>
       </w:r>
+    </w:p>
+    <w:tbl>
+      <w:tblPr>
+        <w:tblW w:type="auto" w:w="0"/>
+        <w:jc w:val="center"/>
+        <w:tblLook w:firstColumn="1" w:firstRow="1" w:lastColumn="0" w:lastRow="0" w:noHBand="0" w:noVBand="1" w:val="04A0"/>
+        <w:tblCellMar>
+          <w:top w:w="110" w:type="dxa"/>
+          <w:bottom w:w="110" w:type="dxa"/>
+          <w:start w:w="180" w:type="dxa"/>
+          <w:end w:w="150" w:type="dxa"/>
+          <w:left w:w="180" w:type="dxa"/>
+          <w:right w:w="150" w:type="dxa"/>
+        </w:tblCellMar>
+      </w:tblPr>
+      <w:tblGrid>
+        <w:gridCol w:w="9518"/>
+      </w:tblGrid>
+      <w:tr>
+        <w:tc>
+          <w:tcPr>
+            <w:tcW w:type="dxa" w:w="9518"/>
+            <w:shd w:val="clear" w:fill="EEF2F8"/>
+            <w:tcBorders>
+              <w:left w:val="single" w:sz="30" w:space="0" w:color="163A6B"/>
+            </w:tcBorders>
+          </w:tcPr>
+          <w:p>
+            <w:pPr>
+              <w:spacing w:after="60"/>
+            </w:pPr>
+            <w:r>
+              <w:rPr>
+                <w:rFonts w:ascii="Cambria" w:hAnsi="Cambria" w:eastAsia="Cambria"/>
+                <w:b/>
+                <w:i w:val="0"/>
+                <w:color w:val="163A6B"/>
+                <w:sz w:val="24"/>
+              </w:rPr>
+              <w:t>Key Insights</w:t>
+            </w:r>
+          </w:p>
+          <w:p>
+            <w:pPr>
+              <w:spacing w:after="40"/>
+              <w:ind w:left="170"/>
+            </w:pPr>
+            <w:r>
+              <w:rPr>
+                <w:rFonts w:ascii="Times New Roman" w:hAnsi="Times New Roman" w:eastAsia="Times New Roman"/>
+                <w:b w:val="0"/>
+                <w:i w:val="0"/>
+                <w:color w:val="000000"/>
+                <w:sz w:val="22"/>
+              </w:rPr>
+              <w:t>•  Early demand is driven by referrals and completed-project reputation rather than advertising spend.</w:t>
+            </w:r>
+          </w:p>
+          <w:p>
+            <w:pPr>
+              <w:spacing w:after="40"/>
+              <w:ind w:left="170"/>
+            </w:pPr>
+            <w:r>
+              <w:rPr>
+                <w:rFonts w:ascii="Times New Roman" w:hAnsi="Times New Roman" w:eastAsia="Times New Roman"/>
+                <w:b w:val="0"/>
+                <w:i w:val="0"/>
+                <w:color w:val="000000"/>
+                <w:sz w:val="22"/>
+              </w:rPr>
+              <w:t>•  Paid and digital channels are scaled only once revenue can support them.</w:t>
+            </w:r>
+          </w:p>
+        </w:tc>
+      </w:tr>
+    </w:tbl>
+    <w:p>
+      <w:pPr>
+        <w:spacing w:after="80"/>
+      </w:pPr>
     </w:p>
     <w:p>
       <w:r>
@@ -8535,7 +8778,7 @@
           <w:color w:val="595959"/>
           <w:sz w:val="22"/>
         </w:rPr>
-        <w:t>Figure 7: BuildWise's standard twelve-stage project workflow, followed on every project to ensure consistency and transparency.</w:t>
+        <w:t>Figure 7. BuildWise's standard twelve-stage project workflow, followed on every project to ensure consistency and transparency.</w:t>
       </w:r>
     </w:p>
     <w:p>
@@ -8673,8 +8916,89 @@
           <w:color w:val="595959"/>
           <w:sz w:val="22"/>
         </w:rPr>
-        <w:t>Figure 8: BuildWise's stage-wise quality-assurance checkpoints and the safety standards enforced on every site.</w:t>
+        <w:t>Figure 8. BuildWise's stage-wise quality-assurance checkpoints and the safety standards enforced on every site.</w:t>
       </w:r>
+    </w:p>
+    <w:tbl>
+      <w:tblPr>
+        <w:tblW w:type="auto" w:w="0"/>
+        <w:jc w:val="center"/>
+        <w:tblLook w:firstColumn="1" w:firstRow="1" w:lastColumn="0" w:lastRow="0" w:noHBand="0" w:noVBand="1" w:val="04A0"/>
+        <w:tblCellMar>
+          <w:top w:w="110" w:type="dxa"/>
+          <w:bottom w:w="110" w:type="dxa"/>
+          <w:start w:w="180" w:type="dxa"/>
+          <w:end w:w="150" w:type="dxa"/>
+          <w:left w:w="180" w:type="dxa"/>
+          <w:right w:w="150" w:type="dxa"/>
+        </w:tblCellMar>
+      </w:tblPr>
+      <w:tblGrid>
+        <w:gridCol w:w="9518"/>
+      </w:tblGrid>
+      <w:tr>
+        <w:tc>
+          <w:tcPr>
+            <w:tcW w:type="dxa" w:w="9518"/>
+            <w:shd w:val="clear" w:fill="EEF2F8"/>
+            <w:tcBorders>
+              <w:left w:val="single" w:sz="30" w:space="0" w:color="163A6B"/>
+            </w:tcBorders>
+          </w:tcPr>
+          <w:p>
+            <w:pPr>
+              <w:spacing w:after="60"/>
+            </w:pPr>
+            <w:r>
+              <w:rPr>
+                <w:rFonts w:ascii="Cambria" w:hAnsi="Cambria" w:eastAsia="Cambria"/>
+                <w:b/>
+                <w:i w:val="0"/>
+                <w:color w:val="163A6B"/>
+                <w:sz w:val="24"/>
+              </w:rPr>
+              <w:t>Key Insights</w:t>
+            </w:r>
+          </w:p>
+          <w:p>
+            <w:pPr>
+              <w:spacing w:after="40"/>
+              <w:ind w:left="170"/>
+            </w:pPr>
+            <w:r>
+              <w:rPr>
+                <w:rFonts w:ascii="Times New Roman" w:hAnsi="Times New Roman" w:eastAsia="Times New Roman"/>
+                <w:b w:val="0"/>
+                <w:i w:val="0"/>
+                <w:color w:val="000000"/>
+                <w:sz w:val="22"/>
+              </w:rPr>
+              <w:t>•  A single, repeatable workflow keeps every project consistent and transparent.</w:t>
+            </w:r>
+          </w:p>
+          <w:p>
+            <w:pPr>
+              <w:spacing w:after="40"/>
+              <w:ind w:left="170"/>
+            </w:pPr>
+            <w:r>
+              <w:rPr>
+                <w:rFonts w:ascii="Times New Roman" w:hAnsi="Times New Roman" w:eastAsia="Times New Roman"/>
+                <w:b w:val="0"/>
+                <w:i w:val="0"/>
+                <w:color w:val="000000"/>
+                <w:sz w:val="22"/>
+              </w:rPr>
+              <w:t>•  Stage-wise quality checkpoints and on-site safety protect customers and workers alike.</w:t>
+            </w:r>
+          </w:p>
+        </w:tc>
+      </w:tr>
+    </w:tbl>
+    <w:p>
+      <w:pPr>
+        <w:spacing w:after="80"/>
+      </w:pPr>
     </w:p>
     <w:p>
       <w:r>
@@ -9042,7 +9366,7 @@
           <w:color w:val="595959"/>
           <w:sz w:val="22"/>
         </w:rPr>
-        <w:t>Figure 9: The BuildWise customer journey, designed so that customer confidence grows at every stage.</w:t>
+        <w:t>Figure 9. The BuildWise customer journey, designed so that customer confidence grows at every stage.</w:t>
       </w:r>
     </w:p>
     <w:p>
@@ -9518,7 +9842,7 @@
       <w:r>
         <w:drawing>
           <wp:inline xmlns:a="http://schemas.openxmlformats.org/drawingml/2006/main" xmlns:pic="http://schemas.openxmlformats.org/drawingml/2006/picture">
-            <wp:extent cx="5852160" cy="3710816"/>
+            <wp:extent cx="5852160" cy="3485713"/>
             <wp:docPr id="10" name="Picture 10"/>
             <wp:cNvGraphicFramePr>
               <a:graphicFrameLocks noChangeAspect="1"/>
@@ -9539,7 +9863,7 @@
                   <pic:spPr>
                     <a:xfrm>
                       <a:off x="0" y="0"/>
-                      <a:ext cx="5852160" cy="3710816"/>
+                      <a:ext cx="5852160" cy="3485713"/>
                     </a:xfrm>
                     <a:prstGeom prst="rect"/>
                   </pic:spPr>
@@ -9563,8 +9887,89 @@
           <w:color w:val="595959"/>
           <w:sz w:val="22"/>
         </w:rPr>
-        <w:t>Figure 10: BuildWise's lean startup-stage organisation structure, with specialised departments introduced as the company grows.</w:t>
+        <w:t>Figure 10. BuildWise's lean startup-stage organisation structure, with specialised departments introduced as the company grows.</w:t>
       </w:r>
+    </w:p>
+    <w:tbl>
+      <w:tblPr>
+        <w:tblW w:type="auto" w:w="0"/>
+        <w:jc w:val="center"/>
+        <w:tblLook w:firstColumn="1" w:firstRow="1" w:lastColumn="0" w:lastRow="0" w:noHBand="0" w:noVBand="1" w:val="04A0"/>
+        <w:tblCellMar>
+          <w:top w:w="110" w:type="dxa"/>
+          <w:bottom w:w="110" w:type="dxa"/>
+          <w:start w:w="180" w:type="dxa"/>
+          <w:end w:w="150" w:type="dxa"/>
+          <w:left w:w="180" w:type="dxa"/>
+          <w:right w:w="150" w:type="dxa"/>
+        </w:tblCellMar>
+      </w:tblPr>
+      <w:tblGrid>
+        <w:gridCol w:w="9518"/>
+      </w:tblGrid>
+      <w:tr>
+        <w:tc>
+          <w:tcPr>
+            <w:tcW w:type="dxa" w:w="9518"/>
+            <w:shd w:val="clear" w:fill="EEF2F8"/>
+            <w:tcBorders>
+              <w:left w:val="single" w:sz="30" w:space="0" w:color="163A6B"/>
+            </w:tcBorders>
+          </w:tcPr>
+          <w:p>
+            <w:pPr>
+              <w:spacing w:after="60"/>
+            </w:pPr>
+            <w:r>
+              <w:rPr>
+                <w:rFonts w:ascii="Cambria" w:hAnsi="Cambria" w:eastAsia="Cambria"/>
+                <w:b/>
+                <w:i w:val="0"/>
+                <w:color w:val="163A6B"/>
+                <w:sz w:val="24"/>
+              </w:rPr>
+              <w:t>Key Insights</w:t>
+            </w:r>
+          </w:p>
+          <w:p>
+            <w:pPr>
+              <w:spacing w:after="40"/>
+              <w:ind w:left="170"/>
+            </w:pPr>
+            <w:r>
+              <w:rPr>
+                <w:rFonts w:ascii="Times New Roman" w:hAnsi="Times New Roman" w:eastAsia="Times New Roman"/>
+                <w:b w:val="0"/>
+                <w:i w:val="0"/>
+                <w:color w:val="000000"/>
+                <w:sz w:val="22"/>
+              </w:rPr>
+              <w:t>•  A lean, multi-role team keeps overhead low during the startup stage.</w:t>
+            </w:r>
+          </w:p>
+          <w:p>
+            <w:pPr>
+              <w:spacing w:after="40"/>
+              <w:ind w:left="170"/>
+            </w:pPr>
+            <w:r>
+              <w:rPr>
+                <w:rFonts w:ascii="Times New Roman" w:hAnsi="Times New Roman" w:eastAsia="Times New Roman"/>
+                <w:b w:val="0"/>
+                <w:i w:val="0"/>
+                <w:color w:val="000000"/>
+                <w:sz w:val="22"/>
+              </w:rPr>
+              <w:t>•  Specialised departments are added only as revenue and project volume grow.</w:t>
+            </w:r>
+          </w:p>
+        </w:tc>
+      </w:tr>
+    </w:tbl>
+    <w:p>
+      <w:pPr>
+        <w:spacing w:after="80"/>
+      </w:pPr>
     </w:p>
     <w:p>
       <w:r>
@@ -9724,7 +10129,7 @@
           <w:color w:val="595959"/>
           <w:sz w:val="22"/>
         </w:rPr>
-        <w:t>Figure 11: Financial highlights at a glance.</w:t>
+        <w:t>Figure 11. Financial highlights at a glance.</w:t>
       </w:r>
     </w:p>
     <w:p>
@@ -10659,7 +11064,7 @@
           <w:color w:val="595959"/>
           <w:sz w:val="22"/>
         </w:rPr>
-        <w:t>Figure 12: Allocation of the ₹1.00 Crore startup capital across major categories.</w:t>
+        <w:t>Figure 12. Allocation of the ₹1.00 Crore startup capital across major categories.</w:t>
       </w:r>
     </w:p>
     <w:p>
@@ -10784,6 +11189,202 @@
         </w:rPr>
         <w:t>Construction input costs are assumed to rise by 3–5% annually and are built into quotations [5].</w:t>
       </w:r>
+    </w:p>
+    <w:tbl>
+      <w:tblPr>
+        <w:tblW w:type="auto" w:w="0"/>
+        <w:jc w:val="center"/>
+        <w:tblLook w:firstColumn="1" w:firstRow="1" w:lastColumn="0" w:lastRow="0" w:noHBand="0" w:noVBand="1" w:val="04A0"/>
+        <w:tblCellMar>
+          <w:top w:w="120" w:type="dxa"/>
+          <w:bottom w:w="120" w:type="dxa"/>
+          <w:start w:w="70" w:type="dxa"/>
+          <w:end w:w="70" w:type="dxa"/>
+          <w:left w:w="70" w:type="dxa"/>
+          <w:right w:w="70" w:type="dxa"/>
+        </w:tblCellMar>
+      </w:tblPr>
+      <w:tblGrid>
+        <w:gridCol w:w="2379"/>
+        <w:gridCol w:w="2379"/>
+        <w:gridCol w:w="2379"/>
+        <w:gridCol w:w="2379"/>
+      </w:tblGrid>
+      <w:tr>
+        <w:tc>
+          <w:tcPr>
+            <w:tcW w:type="dxa" w:w="2268"/>
+            <w:vAlign w:val="center"/>
+            <w:shd w:val="clear" w:fill="163A6B"/>
+            <w:tcBorders>
+              <w:left w:val="single" w:sz="12" w:space="0" w:color="FFFFFF"/>
+            </w:tcBorders>
+          </w:tcPr>
+          <w:p>
+            <w:pPr>
+              <w:spacing w:after="40"/>
+              <w:jc w:val="center"/>
+            </w:pPr>
+            <w:r>
+              <w:rPr>
+                <w:rFonts w:ascii="Cambria" w:hAnsi="Cambria" w:eastAsia="Cambria"/>
+                <w:b/>
+                <w:i w:val="0"/>
+                <w:color w:val="FFFFFF"/>
+                <w:sz w:val="36"/>
+              </w:rPr>
+              <w:t>~80%</w:t>
+            </w:r>
+          </w:p>
+          <w:p>
+            <w:pPr>
+              <w:spacing w:after="0"/>
+              <w:jc w:val="center"/>
+            </w:pPr>
+            <w:r>
+              <w:rPr>
+                <w:rFonts w:ascii="Times New Roman" w:hAnsi="Times New Roman" w:eastAsia="Times New Roman"/>
+                <w:b w:val="0"/>
+                <w:i w:val="0"/>
+                <w:color w:val="D6E0EE"/>
+                <w:sz w:val="19"/>
+              </w:rPr>
+              <w:t>Direct Project Costs</w:t>
+            </w:r>
+          </w:p>
+        </w:tc>
+        <w:tc>
+          <w:tcPr>
+            <w:tcW w:type="dxa" w:w="2268"/>
+            <w:vAlign w:val="center"/>
+            <w:shd w:val="clear" w:fill="163A6B"/>
+            <w:tcBorders>
+              <w:left w:val="single" w:sz="12" w:space="0" w:color="FFFFFF"/>
+            </w:tcBorders>
+          </w:tcPr>
+          <w:p>
+            <w:pPr>
+              <w:spacing w:after="40"/>
+              <w:jc w:val="center"/>
+            </w:pPr>
+            <w:r>
+              <w:rPr>
+                <w:rFonts w:ascii="Cambria" w:hAnsi="Cambria" w:eastAsia="Cambria"/>
+                <w:b/>
+                <w:i w:val="0"/>
+                <w:color w:val="FFFFFF"/>
+                <w:sz w:val="36"/>
+              </w:rPr>
+              <w:t>~20%</w:t>
+            </w:r>
+          </w:p>
+          <w:p>
+            <w:pPr>
+              <w:spacing w:after="0"/>
+              <w:jc w:val="center"/>
+            </w:pPr>
+            <w:r>
+              <w:rPr>
+                <w:rFonts w:ascii="Times New Roman" w:hAnsi="Times New Roman" w:eastAsia="Times New Roman"/>
+                <w:b w:val="0"/>
+                <w:i w:val="0"/>
+                <w:color w:val="D6E0EE"/>
+                <w:sz w:val="19"/>
+              </w:rPr>
+              <w:t>Contribution Margin</w:t>
+            </w:r>
+          </w:p>
+        </w:tc>
+        <w:tc>
+          <w:tcPr>
+            <w:tcW w:type="dxa" w:w="2268"/>
+            <w:vAlign w:val="center"/>
+            <w:shd w:val="clear" w:fill="163A6B"/>
+            <w:tcBorders>
+              <w:left w:val="single" w:sz="12" w:space="0" w:color="FFFFFF"/>
+            </w:tcBorders>
+          </w:tcPr>
+          <w:p>
+            <w:pPr>
+              <w:spacing w:after="40"/>
+              <w:jc w:val="center"/>
+            </w:pPr>
+            <w:r>
+              <w:rPr>
+                <w:rFonts w:ascii="Cambria" w:hAnsi="Cambria" w:eastAsia="Cambria"/>
+                <w:b/>
+                <w:i w:val="0"/>
+                <w:color w:val="FFFFFF"/>
+                <w:sz w:val="36"/>
+              </w:rPr>
+              <w:t>₹1.50 Cr</w:t>
+            </w:r>
+          </w:p>
+          <w:p>
+            <w:pPr>
+              <w:spacing w:after="0"/>
+              <w:jc w:val="center"/>
+            </w:pPr>
+            <w:r>
+              <w:rPr>
+                <w:rFonts w:ascii="Times New Roman" w:hAnsi="Times New Roman" w:eastAsia="Times New Roman"/>
+                <w:b w:val="0"/>
+                <w:i w:val="0"/>
+                <w:color w:val="D6E0EE"/>
+                <w:sz w:val="19"/>
+              </w:rPr>
+              <w:t>Break-even Revenue</w:t>
+            </w:r>
+          </w:p>
+        </w:tc>
+        <w:tc>
+          <w:tcPr>
+            <w:tcW w:type="dxa" w:w="2268"/>
+            <w:vAlign w:val="center"/>
+            <w:shd w:val="clear" w:fill="163A6B"/>
+            <w:tcBorders>
+              <w:left w:val="single" w:sz="12" w:space="0" w:color="FFFFFF"/>
+            </w:tcBorders>
+          </w:tcPr>
+          <w:p>
+            <w:pPr>
+              <w:spacing w:after="40"/>
+              <w:jc w:val="center"/>
+            </w:pPr>
+            <w:r>
+              <w:rPr>
+                <w:rFonts w:ascii="Cambria" w:hAnsi="Cambria" w:eastAsia="Cambria"/>
+                <w:b/>
+                <w:i w:val="0"/>
+                <w:color w:val="FFFFFF"/>
+                <w:sz w:val="36"/>
+              </w:rPr>
+              <w:t>~7.5%</w:t>
+            </w:r>
+          </w:p>
+          <w:p>
+            <w:pPr>
+              <w:spacing w:after="0"/>
+              <w:jc w:val="center"/>
+            </w:pPr>
+            <w:r>
+              <w:rPr>
+                <w:rFonts w:ascii="Times New Roman" w:hAnsi="Times New Roman" w:eastAsia="Times New Roman"/>
+                <w:b w:val="0"/>
+                <w:i w:val="0"/>
+                <w:color w:val="D6E0EE"/>
+                <w:sz w:val="19"/>
+              </w:rPr>
+              <w:t>Year 3 Net Margin</w:t>
+            </w:r>
+          </w:p>
+        </w:tc>
+      </w:tr>
+    </w:tbl>
+    <w:p>
+      <w:pPr>
+        <w:spacing w:after="80"/>
+      </w:pPr>
     </w:p>
     <w:p>
       <w:pPr>
@@ -11343,7 +11944,7 @@
           <w:color w:val="595959"/>
           <w:sz w:val="22"/>
         </w:rPr>
-        <w:t>Figure 13: Projected total revenue and net profit over the first three years (₹ Crore).</w:t>
+        <w:t>Figure 13. Projected total revenue and net profit over the first three years (₹ Crore).</w:t>
       </w:r>
     </w:p>
     <w:p>
@@ -12770,8 +13371,89 @@
           <w:color w:val="595959"/>
           <w:sz w:val="22"/>
         </w:rPr>
-        <w:t>Figure 14: Break-even analysis — total revenue overtakes total cost at approximately ₹1.50 Crore.</w:t>
+        <w:t>Figure 14. Break-even analysis — total revenue overtakes total cost at approximately ₹1.50 Crore.</w:t>
       </w:r>
+    </w:p>
+    <w:tbl>
+      <w:tblPr>
+        <w:tblW w:type="auto" w:w="0"/>
+        <w:jc w:val="center"/>
+        <w:tblLook w:firstColumn="1" w:firstRow="1" w:lastColumn="0" w:lastRow="0" w:noHBand="0" w:noVBand="1" w:val="04A0"/>
+        <w:tblCellMar>
+          <w:top w:w="110" w:type="dxa"/>
+          <w:bottom w:w="110" w:type="dxa"/>
+          <w:start w:w="180" w:type="dxa"/>
+          <w:end w:w="150" w:type="dxa"/>
+          <w:left w:w="180" w:type="dxa"/>
+          <w:right w:w="150" w:type="dxa"/>
+        </w:tblCellMar>
+      </w:tblPr>
+      <w:tblGrid>
+        <w:gridCol w:w="9518"/>
+      </w:tblGrid>
+      <w:tr>
+        <w:tc>
+          <w:tcPr>
+            <w:tcW w:type="dxa" w:w="9518"/>
+            <w:shd w:val="clear" w:fill="EEF2F8"/>
+            <w:tcBorders>
+              <w:left w:val="single" w:sz="30" w:space="0" w:color="163A6B"/>
+            </w:tcBorders>
+          </w:tcPr>
+          <w:p>
+            <w:pPr>
+              <w:spacing w:after="60"/>
+            </w:pPr>
+            <w:r>
+              <w:rPr>
+                <w:rFonts w:ascii="Cambria" w:hAnsi="Cambria" w:eastAsia="Cambria"/>
+                <w:b/>
+                <w:i w:val="0"/>
+                <w:color w:val="163A6B"/>
+                <w:sz w:val="24"/>
+              </w:rPr>
+              <w:t>Key Insights</w:t>
+            </w:r>
+          </w:p>
+          <w:p>
+            <w:pPr>
+              <w:spacing w:after="40"/>
+              <w:ind w:left="170"/>
+            </w:pPr>
+            <w:r>
+              <w:rPr>
+                <w:rFonts w:ascii="Times New Roman" w:hAnsi="Times New Roman" w:eastAsia="Times New Roman"/>
+                <w:b w:val="0"/>
+                <w:i w:val="0"/>
+                <w:color w:val="000000"/>
+                <w:sz w:val="22"/>
+              </w:rPr>
+              <w:t>•  Break-even is reached within Year 1 at roughly ₹1.50 Crore of revenue.</w:t>
+            </w:r>
+          </w:p>
+          <w:p>
+            <w:pPr>
+              <w:spacing w:after="40"/>
+              <w:ind w:left="170"/>
+            </w:pPr>
+            <w:r>
+              <w:rPr>
+                <w:rFonts w:ascii="Times New Roman" w:hAnsi="Times New Roman" w:eastAsia="Times New Roman"/>
+                <w:b w:val="0"/>
+                <w:i w:val="0"/>
+                <w:color w:val="000000"/>
+                <w:sz w:val="22"/>
+              </w:rPr>
+              <w:t>•  Milestone billing and a contingency reserve safeguard cash flow while the company scales.</w:t>
+            </w:r>
+          </w:p>
+        </w:tc>
+      </w:tr>
+    </w:tbl>
+    <w:p>
+      <w:pPr>
+        <w:spacing w:after="80"/>
+      </w:pPr>
     </w:p>
     <w:p>
       <w:r>
@@ -14057,8 +14739,89 @@
           <w:color w:val="595959"/>
           <w:sz w:val="22"/>
         </w:rPr>
-        <w:t>Figure 15: BuildWise's technology adoption roadmap, introducing capabilities phase by phase as the business grows.</w:t>
+        <w:t>Figure 15. BuildWise's technology adoption roadmap, introducing capabilities phase by phase as the business grows.</w:t>
       </w:r>
+    </w:p>
+    <w:tbl>
+      <w:tblPr>
+        <w:tblW w:type="auto" w:w="0"/>
+        <w:jc w:val="center"/>
+        <w:tblLook w:firstColumn="1" w:firstRow="1" w:lastColumn="0" w:lastRow="0" w:noHBand="0" w:noVBand="1" w:val="04A0"/>
+        <w:tblCellMar>
+          <w:top w:w="110" w:type="dxa"/>
+          <w:bottom w:w="110" w:type="dxa"/>
+          <w:start w:w="180" w:type="dxa"/>
+          <w:end w:w="150" w:type="dxa"/>
+          <w:left w:w="180" w:type="dxa"/>
+          <w:right w:w="150" w:type="dxa"/>
+        </w:tblCellMar>
+      </w:tblPr>
+      <w:tblGrid>
+        <w:gridCol w:w="9518"/>
+      </w:tblGrid>
+      <w:tr>
+        <w:tc>
+          <w:tcPr>
+            <w:tcW w:type="dxa" w:w="9518"/>
+            <w:shd w:val="clear" w:fill="EEF2F8"/>
+            <w:tcBorders>
+              <w:left w:val="single" w:sz="30" w:space="0" w:color="163A6B"/>
+            </w:tcBorders>
+          </w:tcPr>
+          <w:p>
+            <w:pPr>
+              <w:spacing w:after="60"/>
+            </w:pPr>
+            <w:r>
+              <w:rPr>
+                <w:rFonts w:ascii="Cambria" w:hAnsi="Cambria" w:eastAsia="Cambria"/>
+                <w:b/>
+                <w:i w:val="0"/>
+                <w:color w:val="163A6B"/>
+                <w:sz w:val="24"/>
+              </w:rPr>
+              <w:t>Key Insights</w:t>
+            </w:r>
+          </w:p>
+          <w:p>
+            <w:pPr>
+              <w:spacing w:after="40"/>
+              <w:ind w:left="170"/>
+            </w:pPr>
+            <w:r>
+              <w:rPr>
+                <w:rFonts w:ascii="Times New Roman" w:hAnsi="Times New Roman" w:eastAsia="Times New Roman"/>
+                <w:b w:val="0"/>
+                <w:i w:val="0"/>
+                <w:color w:val="000000"/>
+                <w:sz w:val="22"/>
+              </w:rPr>
+              <w:t>•  Technology is adopted phase by phase, funded by proven business growth.</w:t>
+            </w:r>
+          </w:p>
+          <w:p>
+            <w:pPr>
+              <w:spacing w:after="40"/>
+              <w:ind w:left="170"/>
+            </w:pPr>
+            <w:r>
+              <w:rPr>
+                <w:rFonts w:ascii="Times New Roman" w:hAnsi="Times New Roman" w:eastAsia="Times New Roman"/>
+                <w:b w:val="0"/>
+                <w:i w:val="0"/>
+                <w:color w:val="000000"/>
+                <w:sz w:val="22"/>
+              </w:rPr>
+              <w:t>•  Each tool is introduced only to strengthen an operation that already works.</w:t>
+            </w:r>
+          </w:p>
+        </w:tc>
+      </w:tr>
+    </w:tbl>
+    <w:p>
+      <w:pPr>
+        <w:spacing w:after="80"/>
+      </w:pPr>
     </w:p>
     <w:p>
       <w:r>
@@ -14451,8 +15214,89 @@
           <w:color w:val="595959"/>
           <w:sz w:val="22"/>
         </w:rPr>
-        <w:t>Figure 16: BuildWise's five-year growth and expansion timeline, from first projects to technology-enabled operations across India.</w:t>
+        <w:t>Figure 16. BuildWise's five-year growth and expansion timeline, from first projects to technology-enabled operations across India.</w:t>
       </w:r>
+    </w:p>
+    <w:tbl>
+      <w:tblPr>
+        <w:tblW w:type="auto" w:w="0"/>
+        <w:jc w:val="center"/>
+        <w:tblLook w:firstColumn="1" w:firstRow="1" w:lastColumn="0" w:lastRow="0" w:noHBand="0" w:noVBand="1" w:val="04A0"/>
+        <w:tblCellMar>
+          <w:top w:w="110" w:type="dxa"/>
+          <w:bottom w:w="110" w:type="dxa"/>
+          <w:start w:w="180" w:type="dxa"/>
+          <w:end w:w="150" w:type="dxa"/>
+          <w:left w:w="180" w:type="dxa"/>
+          <w:right w:w="150" w:type="dxa"/>
+        </w:tblCellMar>
+      </w:tblPr>
+      <w:tblGrid>
+        <w:gridCol w:w="9518"/>
+      </w:tblGrid>
+      <w:tr>
+        <w:tc>
+          <w:tcPr>
+            <w:tcW w:type="dxa" w:w="9518"/>
+            <w:shd w:val="clear" w:fill="EEF2F8"/>
+            <w:tcBorders>
+              <w:left w:val="single" w:sz="30" w:space="0" w:color="163A6B"/>
+            </w:tcBorders>
+          </w:tcPr>
+          <w:p>
+            <w:pPr>
+              <w:spacing w:after="60"/>
+            </w:pPr>
+            <w:r>
+              <w:rPr>
+                <w:rFonts w:ascii="Cambria" w:hAnsi="Cambria" w:eastAsia="Cambria"/>
+                <w:b/>
+                <w:i w:val="0"/>
+                <w:color w:val="163A6B"/>
+                <w:sz w:val="24"/>
+              </w:rPr>
+              <w:t>Key Insights</w:t>
+            </w:r>
+          </w:p>
+          <w:p>
+            <w:pPr>
+              <w:spacing w:after="40"/>
+              <w:ind w:left="170"/>
+            </w:pPr>
+            <w:r>
+              <w:rPr>
+                <w:rFonts w:ascii="Times New Roman" w:hAnsi="Times New Roman" w:eastAsia="Times New Roman"/>
+                <w:b w:val="0"/>
+                <w:i w:val="0"/>
+                <w:color w:val="000000"/>
+                <w:sz w:val="22"/>
+              </w:rPr>
+              <w:t>•  Expansion follows a trust-first sequence: deliver, earn referrals, then scale.</w:t>
+            </w:r>
+          </w:p>
+          <w:p>
+            <w:pPr>
+              <w:spacing w:after="40"/>
+              <w:ind w:left="170"/>
+            </w:pPr>
+            <w:r>
+              <w:rPr>
+                <w:rFonts w:ascii="Times New Roman" w:hAnsi="Times New Roman" w:eastAsia="Times New Roman"/>
+                <w:b w:val="0"/>
+                <w:i w:val="0"/>
+                <w:color w:val="000000"/>
+                <w:sz w:val="22"/>
+              </w:rPr>
+              <w:t>•  Multi-city, commercial, and premium segments come only after local success is proven.</w:t>
+            </w:r>
+          </w:p>
+        </w:tc>
+      </w:tr>
+    </w:tbl>
+    <w:p>
+      <w:pPr>
+        <w:spacing w:after="80"/>
+      </w:pPr>
     </w:p>
     <w:p>
       <w:r>
@@ -14587,8 +15431,89 @@
           <w:color w:val="595959"/>
           <w:sz w:val="22"/>
         </w:rPr>
-        <w:t>Figure 17: BuildWise's sustainability and ESG framework across environmental, social, and governance pillars.</w:t>
+        <w:t>Figure 17. BuildWise's sustainability and ESG framework across environmental, social, and governance pillars.</w:t>
       </w:r>
+    </w:p>
+    <w:tbl>
+      <w:tblPr>
+        <w:tblW w:type="auto" w:w="0"/>
+        <w:jc w:val="center"/>
+        <w:tblLook w:firstColumn="1" w:firstRow="1" w:lastColumn="0" w:lastRow="0" w:noHBand="0" w:noVBand="1" w:val="04A0"/>
+        <w:tblCellMar>
+          <w:top w:w="110" w:type="dxa"/>
+          <w:bottom w:w="110" w:type="dxa"/>
+          <w:start w:w="180" w:type="dxa"/>
+          <w:end w:w="150" w:type="dxa"/>
+          <w:left w:w="180" w:type="dxa"/>
+          <w:right w:w="150" w:type="dxa"/>
+        </w:tblCellMar>
+      </w:tblPr>
+      <w:tblGrid>
+        <w:gridCol w:w="9518"/>
+      </w:tblGrid>
+      <w:tr>
+        <w:tc>
+          <w:tcPr>
+            <w:tcW w:type="dxa" w:w="9518"/>
+            <w:shd w:val="clear" w:fill="EEF2F8"/>
+            <w:tcBorders>
+              <w:left w:val="single" w:sz="30" w:space="0" w:color="163A6B"/>
+            </w:tcBorders>
+          </w:tcPr>
+          <w:p>
+            <w:pPr>
+              <w:spacing w:after="60"/>
+            </w:pPr>
+            <w:r>
+              <w:rPr>
+                <w:rFonts w:ascii="Cambria" w:hAnsi="Cambria" w:eastAsia="Cambria"/>
+                <w:b/>
+                <w:i w:val="0"/>
+                <w:color w:val="163A6B"/>
+                <w:sz w:val="24"/>
+              </w:rPr>
+              <w:t>Key Insights</w:t>
+            </w:r>
+          </w:p>
+          <w:p>
+            <w:pPr>
+              <w:spacing w:after="40"/>
+              <w:ind w:left="170"/>
+            </w:pPr>
+            <w:r>
+              <w:rPr>
+                <w:rFonts w:ascii="Times New Roman" w:hAnsi="Times New Roman" w:eastAsia="Times New Roman"/>
+                <w:b w:val="0"/>
+                <w:i w:val="0"/>
+                <w:color w:val="000000"/>
+                <w:sz w:val="22"/>
+              </w:rPr>
+              <w:t>•  Sustainability spans environmental, social, and governance responsibilities together.</w:t>
+            </w:r>
+          </w:p>
+          <w:p>
+            <w:pPr>
+              <w:spacing w:after="40"/>
+              <w:ind w:left="170"/>
+            </w:pPr>
+            <w:r>
+              <w:rPr>
+                <w:rFonts w:ascii="Times New Roman" w:hAnsi="Times New Roman" w:eastAsia="Times New Roman"/>
+                <w:b w:val="0"/>
+                <w:i w:val="0"/>
+                <w:color w:val="000000"/>
+                <w:sz w:val="22"/>
+              </w:rPr>
+              <w:t>•  ESG and CSR commitments scale in proportion to the company's growth and profitability.</w:t>
+            </w:r>
+          </w:p>
+        </w:tc>
+      </w:tr>
+    </w:tbl>
+    <w:p>
+      <w:pPr>
+        <w:spacing w:after="80"/>
+      </w:pPr>
     </w:p>
     <w:p>
       <w:r>
@@ -14671,6 +15596,70 @@
         <w:t xml:space="preserve"> — the company intends to grow one excellent project, one satisfied customer, and one reinvested rupee at a time.</w:t>
       </w:r>
     </w:p>
+    <w:tbl>
+      <w:tblPr>
+        <w:tblW w:type="auto" w:w="0"/>
+        <w:jc w:val="center"/>
+        <w:tblLook w:firstColumn="1" w:firstRow="1" w:lastColumn="0" w:lastRow="0" w:noHBand="0" w:noVBand="1" w:val="04A0"/>
+        <w:tblCellMar>
+          <w:top w:w="110" w:type="dxa"/>
+          <w:bottom w:w="110" w:type="dxa"/>
+          <w:start w:w="180" w:type="dxa"/>
+          <w:end w:w="150" w:type="dxa"/>
+          <w:left w:w="180" w:type="dxa"/>
+          <w:right w:w="150" w:type="dxa"/>
+        </w:tblCellMar>
+      </w:tblPr>
+      <w:tblGrid>
+        <w:gridCol w:w="9518"/>
+      </w:tblGrid>
+      <w:tr>
+        <w:tc>
+          <w:tcPr>
+            <w:tcW w:type="dxa" w:w="9518"/>
+            <w:shd w:val="clear" w:fill="EEF2F8"/>
+            <w:tcBorders>
+              <w:left w:val="single" w:sz="30" w:space="0" w:color="163A6B"/>
+            </w:tcBorders>
+          </w:tcPr>
+          <w:p>
+            <w:pPr>
+              <w:spacing w:after="40"/>
+            </w:pPr>
+            <w:r>
+              <w:rPr>
+                <w:rFonts w:ascii="Cambria" w:hAnsi="Cambria" w:eastAsia="Cambria"/>
+                <w:b/>
+                <w:i w:val="0"/>
+                <w:color w:val="163A6B"/>
+                <w:sz w:val="24"/>
+              </w:rPr>
+              <w:t>Final Takeaway</w:t>
+            </w:r>
+          </w:p>
+          <w:p>
+            <w:pPr>
+              <w:spacing w:after="0"/>
+            </w:pPr>
+            <w:r>
+              <w:rPr>
+                <w:rFonts w:ascii="Times New Roman" w:hAnsi="Times New Roman" w:eastAsia="Times New Roman"/>
+                <w:b w:val="0"/>
+                <w:i w:val="0"/>
+                <w:color w:val="000000"/>
+                <w:sz w:val="23"/>
+              </w:rPr>
+              <w:t>BuildWise pursues an ambitious vision responsibly — earning trust, revenue, and capability one project at a time, and adopting technology only when it strengthens the customer experience.</w:t>
+            </w:r>
+          </w:p>
+        </w:tc>
+      </w:tr>
+    </w:tbl>
+    <w:p>
+      <w:pPr>
+        <w:spacing w:after="80"/>
+      </w:pPr>
+    </w:p>
     <w:p>
       <w:pPr>
         <w:keepNext/>
@@ -14725,7 +15714,7 @@
           <w:color w:val="595959"/>
           <w:sz w:val="22"/>
         </w:rPr>
-        <w:t>Figure 18: Key takeaways from the BuildWise business plan.</w:t>
+        <w:t>Figure 18. Key takeaways from the BuildWise business plan.</w:t>
       </w:r>
     </w:p>
     <w:p>

</xml_diff>